<commit_message>
docs: add functional requirements
</commit_message>
<xml_diff>
--- a/02_SRS/StudyFlow_SRS_v1.0.docx.docx
+++ b/02_SRS/StudyFlow_SRS_v1.0.docx.docx
@@ -46,7 +46,23 @@
           <w:sz w:val="28"/>
           <w:szCs w:val="32"/>
         </w:rPr>
-        <w:t>This SRS defines the functional and non-functional requirements of StudyFlow and guides its design, development, testing, and maintenance.</w:t>
+        <w:t xml:space="preserve">This SRS defines the functional and non-functional requirements of </w:t>
+      </w:r>
+      <w:proofErr w:type="spellStart"/>
+      <w:r>
+        <w:rPr>
+          <w:sz w:val="28"/>
+          <w:szCs w:val="32"/>
+        </w:rPr>
+        <w:t>StudyFlow</w:t>
+      </w:r>
+      <w:proofErr w:type="spellEnd"/>
+      <w:r>
+        <w:rPr>
+          <w:sz w:val="28"/>
+          <w:szCs w:val="32"/>
+        </w:rPr>
+        <w:t xml:space="preserve"> and guides its design, development, testing, and maintenance.</w:t>
       </w:r>
     </w:p>
     <w:p>
@@ -83,12 +99,21 @@
           <w:szCs w:val="32"/>
         </w:rPr>
       </w:pPr>
-      <w:r>
-        <w:rPr>
-          <w:sz w:val="28"/>
-          <w:szCs w:val="32"/>
-        </w:rPr>
-        <w:t>StudyFlow is a web application that allows students to manage academic tasks, deadlines, priorities, and progress through a personal account. It will use HTML, CSS, JavaScript, Java Spring Boot, and MySQL. AI recommendations, shared tasks, WhatsApp notifications, and mobile apps are excluded from Version 1.</w:t>
+      <w:proofErr w:type="spellStart"/>
+      <w:r>
+        <w:rPr>
+          <w:sz w:val="28"/>
+          <w:szCs w:val="32"/>
+        </w:rPr>
+        <w:t>StudyFlow</w:t>
+      </w:r>
+      <w:proofErr w:type="spellEnd"/>
+      <w:r>
+        <w:rPr>
+          <w:sz w:val="28"/>
+          <w:szCs w:val="32"/>
+        </w:rPr>
+        <w:t xml:space="preserve"> is a web application that allows students to manage academic tasks, deadlines, priorities, and progress through a personal account. It will use HTML, CSS, JavaScript, Java Spring Boot, and MySQL. AI recommendations, shared tasks, WhatsApp notifications, and mobile apps are excluded from Version 1.</w:t>
       </w:r>
     </w:p>
     <w:p>
@@ -325,31 +350,69 @@
           <w:sz w:val="28"/>
           <w:szCs w:val="32"/>
         </w:rPr>
-        <w:t xml:space="preserve"> Unified Modeling Language</w:t>
-      </w:r>
+        <w:t xml:space="preserve"> Unified Modeling Languag</w:t>
+      </w:r>
+      <w:r>
+        <w:rPr>
+          <w:sz w:val="28"/>
+          <w:szCs w:val="32"/>
+        </w:rPr>
+        <w:t>e</w:t>
+      </w:r>
+    </w:p>
+    <w:p>
+      <w:pPr>
+        <w:rPr>
+          <w:sz w:val="28"/>
+          <w:szCs w:val="32"/>
+        </w:rPr>
+      </w:pPr>
+    </w:p>
+    <w:p>
+      <w:pPr>
+        <w:rPr>
+          <w:sz w:val="28"/>
+          <w:szCs w:val="32"/>
+        </w:rPr>
+      </w:pPr>
     </w:p>
     <w:p>
       <w:pPr>
         <w:pStyle w:val="Heading1"/>
+        <w:numPr>
+          <w:ilvl w:val="0"/>
+          <w:numId w:val="5"/>
+        </w:numPr>
       </w:pPr>
       <w:r>
         <w:lastRenderedPageBreak/>
-        <w:t>2. OVERALL DESCRIPTION</w:t>
-      </w:r>
+        <w:t>OVERALL DESCRIPTION</w:t>
+      </w:r>
+    </w:p>
+    <w:p>
+      <w:pPr>
+        <w:ind w:left="360"/>
+        <w:rPr>
+          <w:sz w:val="24"/>
+          <w:szCs w:val="24"/>
+        </w:rPr>
+      </w:pPr>
     </w:p>
     <w:p>
       <w:pPr>
         <w:rPr>
           <w:b/>
           <w:bCs/>
-          <w:szCs w:val="28"/>
+          <w:sz w:val="28"/>
+          <w:szCs w:val="36"/>
         </w:rPr>
       </w:pPr>
       <w:r>
         <w:rPr>
           <w:b/>
           <w:bCs/>
-          <w:szCs w:val="28"/>
+          <w:sz w:val="28"/>
+          <w:szCs w:val="36"/>
         </w:rPr>
         <w:t>2.1 Product Perspective</w:t>
       </w:r>
@@ -357,14 +420,25 @@
     <w:p>
       <w:pPr>
         <w:rPr>
-          <w:szCs w:val="28"/>
-        </w:rPr>
-      </w:pPr>
-      <w:r>
-        <w:rPr>
-          <w:szCs w:val="28"/>
-        </w:rPr>
-        <w:t>StudyFlow is a web application that uses a frontend, Java Spring Boot backend, and MySQL database to manage user accounts and academic tasks.</w:t>
+          <w:sz w:val="24"/>
+          <w:szCs w:val="32"/>
+        </w:rPr>
+      </w:pPr>
+      <w:proofErr w:type="spellStart"/>
+      <w:r>
+        <w:rPr>
+          <w:sz w:val="24"/>
+          <w:szCs w:val="32"/>
+        </w:rPr>
+        <w:t>StudyFlow</w:t>
+      </w:r>
+      <w:proofErr w:type="spellEnd"/>
+      <w:r>
+        <w:rPr>
+          <w:sz w:val="24"/>
+          <w:szCs w:val="32"/>
+        </w:rPr>
+        <w:t xml:space="preserve"> is a web application that uses a frontend, Java Spring Boot backend, and MySQL database to manage user accounts and academic tasks.</w:t>
       </w:r>
     </w:p>
     <w:p>
@@ -372,14 +446,16 @@
         <w:rPr>
           <w:b/>
           <w:bCs/>
-          <w:szCs w:val="28"/>
+          <w:sz w:val="28"/>
+          <w:szCs w:val="36"/>
         </w:rPr>
       </w:pPr>
       <w:r>
         <w:rPr>
           <w:b/>
           <w:bCs/>
-          <w:szCs w:val="28"/>
+          <w:sz w:val="28"/>
+          <w:szCs w:val="36"/>
         </w:rPr>
         <w:t>2.2 Product Functions</w:t>
       </w:r>
@@ -387,14 +463,25 @@
     <w:p>
       <w:pPr>
         <w:rPr>
-          <w:szCs w:val="28"/>
-        </w:rPr>
-      </w:pPr>
-      <w:r>
-        <w:rPr>
-          <w:szCs w:val="28"/>
-        </w:rPr>
-        <w:t>StudyFlow will provide:</w:t>
+          <w:sz w:val="24"/>
+          <w:szCs w:val="32"/>
+        </w:rPr>
+      </w:pPr>
+      <w:proofErr w:type="spellStart"/>
+      <w:r>
+        <w:rPr>
+          <w:sz w:val="24"/>
+          <w:szCs w:val="32"/>
+        </w:rPr>
+        <w:t>StudyFlow</w:t>
+      </w:r>
+      <w:proofErr w:type="spellEnd"/>
+      <w:r>
+        <w:rPr>
+          <w:sz w:val="24"/>
+          <w:szCs w:val="32"/>
+        </w:rPr>
+        <w:t xml:space="preserve"> will provide:</w:t>
       </w:r>
     </w:p>
     <w:p>
@@ -404,12 +491,14 @@
           <w:numId w:val="6"/>
         </w:numPr>
         <w:rPr>
-          <w:szCs w:val="28"/>
-        </w:rPr>
-      </w:pPr>
-      <w:r>
-        <w:rPr>
-          <w:szCs w:val="28"/>
+          <w:sz w:val="24"/>
+          <w:szCs w:val="32"/>
+        </w:rPr>
+      </w:pPr>
+      <w:r>
+        <w:rPr>
+          <w:sz w:val="24"/>
+          <w:szCs w:val="32"/>
         </w:rPr>
         <w:t>User registration, login, and logout.</w:t>
       </w:r>
@@ -421,12 +510,14 @@
           <w:numId w:val="6"/>
         </w:numPr>
         <w:rPr>
-          <w:szCs w:val="28"/>
-        </w:rPr>
-      </w:pPr>
-      <w:r>
-        <w:rPr>
-          <w:szCs w:val="28"/>
+          <w:sz w:val="24"/>
+          <w:szCs w:val="32"/>
+        </w:rPr>
+      </w:pPr>
+      <w:r>
+        <w:rPr>
+          <w:sz w:val="24"/>
+          <w:szCs w:val="32"/>
         </w:rPr>
         <w:t>Create, view, edit, and delete tasks.</w:t>
       </w:r>
@@ -438,12 +529,14 @@
           <w:numId w:val="6"/>
         </w:numPr>
         <w:rPr>
-          <w:szCs w:val="28"/>
-        </w:rPr>
-      </w:pPr>
-      <w:r>
-        <w:rPr>
-          <w:szCs w:val="28"/>
+          <w:sz w:val="24"/>
+          <w:szCs w:val="32"/>
+        </w:rPr>
+      </w:pPr>
+      <w:r>
+        <w:rPr>
+          <w:sz w:val="24"/>
+          <w:szCs w:val="32"/>
         </w:rPr>
         <w:t>Manage task details, deadlines, and priorities.</w:t>
       </w:r>
@@ -455,12 +548,14 @@
           <w:numId w:val="6"/>
         </w:numPr>
         <w:rPr>
-          <w:szCs w:val="28"/>
-        </w:rPr>
-      </w:pPr>
-      <w:r>
-        <w:rPr>
-          <w:szCs w:val="28"/>
+          <w:sz w:val="24"/>
+          <w:szCs w:val="32"/>
+        </w:rPr>
+      </w:pPr>
+      <w:r>
+        <w:rPr>
+          <w:sz w:val="24"/>
+          <w:szCs w:val="32"/>
         </w:rPr>
         <w:t>Track Pending, In Progress, and Completed tasks.</w:t>
       </w:r>
@@ -472,12 +567,14 @@
           <w:numId w:val="6"/>
         </w:numPr>
         <w:rPr>
-          <w:szCs w:val="28"/>
-        </w:rPr>
-      </w:pPr>
-      <w:r>
-        <w:rPr>
-          <w:szCs w:val="28"/>
+          <w:sz w:val="24"/>
+          <w:szCs w:val="32"/>
+        </w:rPr>
+      </w:pPr>
+      <w:r>
+        <w:rPr>
+          <w:sz w:val="24"/>
+          <w:szCs w:val="32"/>
         </w:rPr>
         <w:t>Identify overdue tasks.</w:t>
       </w:r>
@@ -489,12 +586,14 @@
           <w:numId w:val="6"/>
         </w:numPr>
         <w:rPr>
-          <w:szCs w:val="28"/>
-        </w:rPr>
-      </w:pPr>
-      <w:r>
-        <w:rPr>
-          <w:szCs w:val="28"/>
+          <w:sz w:val="24"/>
+          <w:szCs w:val="32"/>
+        </w:rPr>
+      </w:pPr>
+      <w:r>
+        <w:rPr>
+          <w:sz w:val="24"/>
+          <w:szCs w:val="32"/>
         </w:rPr>
         <w:t>Display dashboard summaries and filter tasks.</w:t>
       </w:r>
@@ -506,12 +605,14 @@
           <w:numId w:val="6"/>
         </w:numPr>
         <w:rPr>
-          <w:szCs w:val="28"/>
-        </w:rPr>
-      </w:pPr>
-      <w:r>
-        <w:rPr>
-          <w:szCs w:val="28"/>
+          <w:sz w:val="24"/>
+          <w:szCs w:val="32"/>
+        </w:rPr>
+      </w:pPr>
+      <w:r>
+        <w:rPr>
+          <w:sz w:val="24"/>
+          <w:szCs w:val="32"/>
         </w:rPr>
         <w:t>Save task data in the database.</w:t>
       </w:r>
@@ -521,14 +622,16 @@
         <w:rPr>
           <w:b/>
           <w:bCs/>
-          <w:szCs w:val="28"/>
+          <w:sz w:val="28"/>
+          <w:szCs w:val="36"/>
         </w:rPr>
       </w:pPr>
       <w:r>
         <w:rPr>
           <w:b/>
           <w:bCs/>
-          <w:szCs w:val="28"/>
+          <w:sz w:val="28"/>
+          <w:szCs w:val="36"/>
         </w:rPr>
         <w:t>2.</w:t>
       </w:r>
@@ -536,7 +639,8 @@
         <w:rPr>
           <w:b/>
           <w:bCs/>
-          <w:szCs w:val="28"/>
+          <w:sz w:val="28"/>
+          <w:szCs w:val="36"/>
         </w:rPr>
         <w:t>3</w:t>
       </w:r>
@@ -544,7 +648,8 @@
         <w:rPr>
           <w:b/>
           <w:bCs/>
-          <w:szCs w:val="28"/>
+          <w:sz w:val="28"/>
+          <w:szCs w:val="36"/>
         </w:rPr>
         <w:t xml:space="preserve"> Operating Environment</w:t>
       </w:r>
@@ -552,12 +657,14 @@
     <w:p>
       <w:pPr>
         <w:rPr>
-          <w:szCs w:val="28"/>
-        </w:rPr>
-      </w:pPr>
-      <w:r>
-        <w:rPr>
-          <w:szCs w:val="28"/>
+          <w:sz w:val="24"/>
+          <w:szCs w:val="32"/>
+        </w:rPr>
+      </w:pPr>
+      <w:r>
+        <w:rPr>
+          <w:sz w:val="24"/>
+          <w:szCs w:val="32"/>
         </w:rPr>
         <w:t>The system will run in a compatible desktop web browser. The planned technologies are HTML, CSS, JavaScript, Java Spring Boot, and MySQL. Git and GitHub will be used for version control.</w:t>
       </w:r>
@@ -567,14 +674,16 @@
         <w:rPr>
           <w:b/>
           <w:bCs/>
-          <w:szCs w:val="28"/>
+          <w:sz w:val="24"/>
+          <w:szCs w:val="32"/>
         </w:rPr>
       </w:pPr>
       <w:r>
         <w:rPr>
           <w:b/>
           <w:bCs/>
-          <w:szCs w:val="28"/>
+          <w:sz w:val="24"/>
+          <w:szCs w:val="32"/>
         </w:rPr>
         <w:t>2.</w:t>
       </w:r>
@@ -582,7 +691,8 @@
         <w:rPr>
           <w:b/>
           <w:bCs/>
-          <w:szCs w:val="28"/>
+          <w:sz w:val="24"/>
+          <w:szCs w:val="32"/>
         </w:rPr>
         <w:t>4</w:t>
       </w:r>
@@ -590,7 +700,8 @@
         <w:rPr>
           <w:b/>
           <w:bCs/>
-          <w:szCs w:val="28"/>
+          <w:sz w:val="24"/>
+          <w:szCs w:val="32"/>
         </w:rPr>
         <w:t xml:space="preserve"> Design and Implementation Constraints</w:t>
       </w:r>
@@ -598,12 +709,14 @@
     <w:p>
       <w:pPr>
         <w:rPr>
-          <w:szCs w:val="28"/>
-        </w:rPr>
-      </w:pPr>
-      <w:r>
-        <w:rPr>
-          <w:szCs w:val="28"/>
+          <w:sz w:val="24"/>
+          <w:szCs w:val="32"/>
+        </w:rPr>
+      </w:pPr>
+      <w:r>
+        <w:rPr>
+          <w:sz w:val="24"/>
+          <w:szCs w:val="32"/>
         </w:rPr>
         <w:t>Development will be limited by the available time and resources. Version 1 will exclude AI recommendations, shared tasks, WhatsApp notifications, and a native mobile application.</w:t>
       </w:r>
@@ -613,14 +726,16 @@
         <w:rPr>
           <w:b/>
           <w:bCs/>
-          <w:szCs w:val="28"/>
+          <w:sz w:val="24"/>
+          <w:szCs w:val="32"/>
         </w:rPr>
       </w:pPr>
       <w:r>
         <w:rPr>
           <w:b/>
           <w:bCs/>
-          <w:szCs w:val="28"/>
+          <w:sz w:val="24"/>
+          <w:szCs w:val="32"/>
         </w:rPr>
         <w:t>2.</w:t>
       </w:r>
@@ -628,7 +743,8 @@
         <w:rPr>
           <w:b/>
           <w:bCs/>
-          <w:szCs w:val="28"/>
+          <w:sz w:val="24"/>
+          <w:szCs w:val="32"/>
         </w:rPr>
         <w:t>5</w:t>
       </w:r>
@@ -636,7 +752,8 @@
         <w:rPr>
           <w:b/>
           <w:bCs/>
-          <w:szCs w:val="28"/>
+          <w:sz w:val="24"/>
+          <w:szCs w:val="32"/>
         </w:rPr>
         <w:t xml:space="preserve"> Assumptions and Dependencies</w:t>
       </w:r>
@@ -648,12 +765,14 @@
           <w:numId w:val="7"/>
         </w:numPr>
         <w:rPr>
-          <w:szCs w:val="28"/>
-        </w:rPr>
-      </w:pPr>
-      <w:r>
-        <w:rPr>
-          <w:szCs w:val="28"/>
+          <w:sz w:val="24"/>
+          <w:szCs w:val="32"/>
+        </w:rPr>
+      </w:pPr>
+      <w:r>
+        <w:rPr>
+          <w:sz w:val="24"/>
+          <w:szCs w:val="32"/>
         </w:rPr>
         <w:t>Users have access to a compatible computer and browser.</w:t>
       </w:r>
@@ -665,12 +784,14 @@
           <w:numId w:val="7"/>
         </w:numPr>
         <w:rPr>
-          <w:szCs w:val="28"/>
-        </w:rPr>
-      </w:pPr>
-      <w:r>
-        <w:rPr>
-          <w:szCs w:val="28"/>
+          <w:sz w:val="24"/>
+          <w:szCs w:val="32"/>
+        </w:rPr>
+      </w:pPr>
+      <w:r>
+        <w:rPr>
+          <w:sz w:val="24"/>
+          <w:szCs w:val="32"/>
         </w:rPr>
         <w:t>Users enter valid account and task details.</w:t>
       </w:r>
@@ -682,12 +803,14 @@
           <w:numId w:val="7"/>
         </w:numPr>
         <w:rPr>
-          <w:szCs w:val="28"/>
-        </w:rPr>
-      </w:pPr>
-      <w:r>
-        <w:rPr>
-          <w:szCs w:val="28"/>
+          <w:sz w:val="24"/>
+          <w:szCs w:val="32"/>
+        </w:rPr>
+      </w:pPr>
+      <w:r>
+        <w:rPr>
+          <w:sz w:val="24"/>
+          <w:szCs w:val="32"/>
         </w:rPr>
         <w:t>The application server and database are available during use.</w:t>
       </w:r>
@@ -699,12 +822,14 @@
           <w:numId w:val="7"/>
         </w:numPr>
         <w:rPr>
-          <w:szCs w:val="28"/>
-        </w:rPr>
-      </w:pPr>
-      <w:r>
-        <w:rPr>
-          <w:szCs w:val="28"/>
+          <w:sz w:val="24"/>
+          <w:szCs w:val="32"/>
+        </w:rPr>
+      </w:pPr>
+      <w:r>
+        <w:rPr>
+          <w:sz w:val="24"/>
+          <w:szCs w:val="32"/>
         </w:rPr>
         <w:t>Required development tools and technologies are properly configured.</w:t>
       </w:r>
@@ -716,6 +841,21 @@
           <w:numId w:val="7"/>
         </w:numPr>
         <w:rPr>
+          <w:sz w:val="24"/>
+          <w:szCs w:val="32"/>
+        </w:rPr>
+      </w:pPr>
+      <w:r>
+        <w:rPr>
+          <w:sz w:val="24"/>
+          <w:szCs w:val="32"/>
+        </w:rPr>
+        <w:t>Users are responsible for entering accurate deadlines.</w:t>
+      </w:r>
+    </w:p>
+    <w:p>
+      <w:pPr>
+        <w:rPr>
           <w:szCs w:val="28"/>
         </w:rPr>
       </w:pPr>
@@ -723,7 +863,975 @@
         <w:rPr>
           <w:szCs w:val="28"/>
         </w:rPr>
-        <w:t>Users are responsible for entering accurate deadlines.</w:t>
+        <w:br w:type="page"/>
+      </w:r>
+    </w:p>
+    <w:p>
+      <w:pPr>
+        <w:pStyle w:val="Heading1"/>
+        <w:numPr>
+          <w:ilvl w:val="0"/>
+          <w:numId w:val="5"/>
+        </w:numPr>
+      </w:pPr>
+      <w:r>
+        <w:lastRenderedPageBreak/>
+        <w:t>FUNCTIONAL REQUIREMENT</w:t>
+      </w:r>
+      <w:r>
+        <w:t>S</w:t>
+      </w:r>
+    </w:p>
+    <w:p>
+      <w:pPr>
+        <w:pStyle w:val="Heading1"/>
+        <w:rPr>
+          <w:sz w:val="24"/>
+          <w:szCs w:val="24"/>
+        </w:rPr>
+      </w:pPr>
+      <w:r>
+        <w:rPr>
+          <w:sz w:val="24"/>
+          <w:szCs w:val="24"/>
+        </w:rPr>
+        <w:t xml:space="preserve">Functional requirements define the operations that </w:t>
+      </w:r>
+      <w:proofErr w:type="spellStart"/>
+      <w:r>
+        <w:rPr>
+          <w:sz w:val="24"/>
+          <w:szCs w:val="24"/>
+        </w:rPr>
+        <w:t>StudyFlow</w:t>
+      </w:r>
+      <w:proofErr w:type="spellEnd"/>
+      <w:r>
+        <w:rPr>
+          <w:sz w:val="24"/>
+          <w:szCs w:val="24"/>
+        </w:rPr>
+        <w:t xml:space="preserve"> must perform to meet user needs</w:t>
+      </w:r>
+    </w:p>
+    <w:p>
+      <w:pPr>
+        <w:rPr>
+          <w:sz w:val="18"/>
+          <w:szCs w:val="18"/>
+        </w:rPr>
+      </w:pPr>
+    </w:p>
+    <w:p>
+      <w:pPr>
+        <w:pStyle w:val="ListParagraph"/>
+        <w:ind w:left="744"/>
+        <w:rPr>
+          <w:sz w:val="16"/>
+          <w:szCs w:val="16"/>
+        </w:rPr>
+      </w:pPr>
+    </w:p>
+    <w:tbl>
+      <w:tblPr>
+        <w:tblpPr w:leftFromText="180" w:rightFromText="180" w:vertAnchor="text" w:horzAnchor="page" w:tblpX="649" w:tblpY="169"/>
+        <w:tblW w:w="10773" w:type="dxa"/>
+        <w:tblCellSpacing w:w="15" w:type="dxa"/>
+        <w:tblBorders>
+          <w:top w:val="single" w:sz="4" w:space="0" w:color="auto"/>
+          <w:left w:val="single" w:sz="4" w:space="0" w:color="auto"/>
+          <w:bottom w:val="single" w:sz="4" w:space="0" w:color="auto"/>
+          <w:right w:val="single" w:sz="4" w:space="0" w:color="auto"/>
+          <w:insideH w:val="single" w:sz="4" w:space="0" w:color="auto"/>
+          <w:insideV w:val="single" w:sz="4" w:space="0" w:color="auto"/>
+        </w:tblBorders>
+        <w:tblCellMar>
+          <w:top w:w="15" w:type="dxa"/>
+          <w:left w:w="15" w:type="dxa"/>
+          <w:bottom w:w="15" w:type="dxa"/>
+          <w:right w:w="15" w:type="dxa"/>
+        </w:tblCellMar>
+        <w:tblLook w:val="04A0" w:firstRow="1" w:lastRow="0" w:firstColumn="1" w:lastColumn="0" w:noHBand="0" w:noVBand="1"/>
+      </w:tblPr>
+      <w:tblGrid>
+        <w:gridCol w:w="1276"/>
+        <w:gridCol w:w="8505"/>
+        <w:gridCol w:w="992"/>
+      </w:tblGrid>
+      <w:tr>
+        <w:trPr>
+          <w:trHeight w:val="23"/>
+          <w:tblCellSpacing w:w="15" w:type="dxa"/>
+        </w:trPr>
+        <w:tc>
+          <w:tcPr>
+            <w:tcW w:w="1231" w:type="dxa"/>
+            <w:vAlign w:val="center"/>
+            <w:hideMark/>
+          </w:tcPr>
+          <w:p>
+            <w:pPr>
+              <w:rPr>
+                <w:b/>
+                <w:bCs/>
+                <w:szCs w:val="28"/>
+              </w:rPr>
+            </w:pPr>
+            <w:r>
+              <w:rPr>
+                <w:b/>
+                <w:bCs/>
+                <w:szCs w:val="28"/>
+              </w:rPr>
+              <w:t>ID</w:t>
+            </w:r>
+          </w:p>
+        </w:tc>
+        <w:tc>
+          <w:tcPr>
+            <w:tcW w:w="8475" w:type="dxa"/>
+            <w:vAlign w:val="center"/>
+            <w:hideMark/>
+          </w:tcPr>
+          <w:p>
+            <w:pPr>
+              <w:rPr>
+                <w:b/>
+                <w:bCs/>
+                <w:szCs w:val="28"/>
+              </w:rPr>
+            </w:pPr>
+            <w:r>
+              <w:rPr>
+                <w:b/>
+                <w:bCs/>
+                <w:szCs w:val="28"/>
+              </w:rPr>
+              <w:t>Requirement</w:t>
+            </w:r>
+          </w:p>
+        </w:tc>
+        <w:tc>
+          <w:tcPr>
+            <w:tcW w:w="947" w:type="dxa"/>
+            <w:vAlign w:val="center"/>
+            <w:hideMark/>
+          </w:tcPr>
+          <w:p>
+            <w:pPr>
+              <w:rPr>
+                <w:b/>
+                <w:bCs/>
+                <w:szCs w:val="28"/>
+              </w:rPr>
+            </w:pPr>
+            <w:r>
+              <w:rPr>
+                <w:b/>
+                <w:bCs/>
+                <w:szCs w:val="28"/>
+              </w:rPr>
+              <w:t>Priority</w:t>
+            </w:r>
+          </w:p>
+        </w:tc>
+      </w:tr>
+      <w:tr>
+        <w:trPr>
+          <w:tblCellSpacing w:w="15" w:type="dxa"/>
+        </w:trPr>
+        <w:tc>
+          <w:tcPr>
+            <w:tcW w:w="1231" w:type="dxa"/>
+            <w:vAlign w:val="center"/>
+            <w:hideMark/>
+          </w:tcPr>
+          <w:p>
+            <w:pPr>
+              <w:rPr>
+                <w:szCs w:val="28"/>
+              </w:rPr>
+            </w:pPr>
+            <w:r>
+              <w:rPr>
+                <w:szCs w:val="28"/>
+              </w:rPr>
+              <w:t>FR-01</w:t>
+            </w:r>
+          </w:p>
+        </w:tc>
+        <w:tc>
+          <w:tcPr>
+            <w:tcW w:w="8475" w:type="dxa"/>
+            <w:vAlign w:val="center"/>
+            <w:hideMark/>
+          </w:tcPr>
+          <w:p>
+            <w:pPr>
+              <w:rPr>
+                <w:szCs w:val="28"/>
+              </w:rPr>
+            </w:pPr>
+            <w:r>
+              <w:rPr>
+                <w:szCs w:val="28"/>
+              </w:rPr>
+              <w:t>The system shall allow users to register an account.</w:t>
+            </w:r>
+          </w:p>
+        </w:tc>
+        <w:tc>
+          <w:tcPr>
+            <w:tcW w:w="947" w:type="dxa"/>
+            <w:vAlign w:val="center"/>
+            <w:hideMark/>
+          </w:tcPr>
+          <w:p>
+            <w:pPr>
+              <w:rPr>
+                <w:szCs w:val="28"/>
+              </w:rPr>
+            </w:pPr>
+            <w:r>
+              <w:rPr>
+                <w:szCs w:val="28"/>
+              </w:rPr>
+              <w:t>High</w:t>
+            </w:r>
+          </w:p>
+        </w:tc>
+      </w:tr>
+      <w:tr>
+        <w:trPr>
+          <w:tblCellSpacing w:w="15" w:type="dxa"/>
+        </w:trPr>
+        <w:tc>
+          <w:tcPr>
+            <w:tcW w:w="1231" w:type="dxa"/>
+            <w:vAlign w:val="center"/>
+            <w:hideMark/>
+          </w:tcPr>
+          <w:p>
+            <w:pPr>
+              <w:rPr>
+                <w:szCs w:val="28"/>
+              </w:rPr>
+            </w:pPr>
+            <w:r>
+              <w:rPr>
+                <w:szCs w:val="28"/>
+              </w:rPr>
+              <w:t>FR-02</w:t>
+            </w:r>
+          </w:p>
+        </w:tc>
+        <w:tc>
+          <w:tcPr>
+            <w:tcW w:w="8475" w:type="dxa"/>
+            <w:vAlign w:val="center"/>
+            <w:hideMark/>
+          </w:tcPr>
+          <w:p>
+            <w:pPr>
+              <w:rPr>
+                <w:szCs w:val="28"/>
+              </w:rPr>
+            </w:pPr>
+            <w:r>
+              <w:rPr>
+                <w:szCs w:val="28"/>
+              </w:rPr>
+              <w:t>The system shall allow registered users to log in and log out.</w:t>
+            </w:r>
+          </w:p>
+        </w:tc>
+        <w:tc>
+          <w:tcPr>
+            <w:tcW w:w="947" w:type="dxa"/>
+            <w:vAlign w:val="center"/>
+            <w:hideMark/>
+          </w:tcPr>
+          <w:p>
+            <w:pPr>
+              <w:rPr>
+                <w:szCs w:val="28"/>
+              </w:rPr>
+            </w:pPr>
+            <w:r>
+              <w:rPr>
+                <w:szCs w:val="28"/>
+              </w:rPr>
+              <w:t>High</w:t>
+            </w:r>
+          </w:p>
+        </w:tc>
+      </w:tr>
+      <w:tr>
+        <w:trPr>
+          <w:tblCellSpacing w:w="15" w:type="dxa"/>
+        </w:trPr>
+        <w:tc>
+          <w:tcPr>
+            <w:tcW w:w="1231" w:type="dxa"/>
+            <w:vAlign w:val="center"/>
+            <w:hideMark/>
+          </w:tcPr>
+          <w:p>
+            <w:pPr>
+              <w:rPr>
+                <w:szCs w:val="28"/>
+              </w:rPr>
+            </w:pPr>
+            <w:r>
+              <w:rPr>
+                <w:szCs w:val="28"/>
+              </w:rPr>
+              <w:t>FR-03</w:t>
+            </w:r>
+          </w:p>
+        </w:tc>
+        <w:tc>
+          <w:tcPr>
+            <w:tcW w:w="8475" w:type="dxa"/>
+            <w:vAlign w:val="center"/>
+            <w:hideMark/>
+          </w:tcPr>
+          <w:p>
+            <w:pPr>
+              <w:rPr>
+                <w:szCs w:val="28"/>
+              </w:rPr>
+            </w:pPr>
+            <w:r>
+              <w:rPr>
+                <w:szCs w:val="28"/>
+              </w:rPr>
+              <w:t>The system shall allow users to create tasks with a title, subject, description, due date, and priority.</w:t>
+            </w:r>
+          </w:p>
+        </w:tc>
+        <w:tc>
+          <w:tcPr>
+            <w:tcW w:w="947" w:type="dxa"/>
+            <w:vAlign w:val="center"/>
+            <w:hideMark/>
+          </w:tcPr>
+          <w:p>
+            <w:pPr>
+              <w:rPr>
+                <w:szCs w:val="28"/>
+              </w:rPr>
+            </w:pPr>
+            <w:r>
+              <w:rPr>
+                <w:szCs w:val="28"/>
+              </w:rPr>
+              <w:t>High</w:t>
+            </w:r>
+          </w:p>
+        </w:tc>
+      </w:tr>
+      <w:tr>
+        <w:trPr>
+          <w:tblCellSpacing w:w="15" w:type="dxa"/>
+        </w:trPr>
+        <w:tc>
+          <w:tcPr>
+            <w:tcW w:w="1231" w:type="dxa"/>
+            <w:vAlign w:val="center"/>
+            <w:hideMark/>
+          </w:tcPr>
+          <w:p>
+            <w:pPr>
+              <w:rPr>
+                <w:szCs w:val="28"/>
+              </w:rPr>
+            </w:pPr>
+            <w:r>
+              <w:rPr>
+                <w:szCs w:val="28"/>
+              </w:rPr>
+              <w:t>FR-04</w:t>
+            </w:r>
+          </w:p>
+        </w:tc>
+        <w:tc>
+          <w:tcPr>
+            <w:tcW w:w="8475" w:type="dxa"/>
+            <w:vAlign w:val="center"/>
+            <w:hideMark/>
+          </w:tcPr>
+          <w:p>
+            <w:pPr>
+              <w:rPr>
+                <w:szCs w:val="28"/>
+              </w:rPr>
+            </w:pPr>
+            <w:r>
+              <w:rPr>
+                <w:szCs w:val="28"/>
+              </w:rPr>
+              <w:t>The system shall display the tasks belonging to the logged-in user.</w:t>
+            </w:r>
+          </w:p>
+        </w:tc>
+        <w:tc>
+          <w:tcPr>
+            <w:tcW w:w="947" w:type="dxa"/>
+            <w:vAlign w:val="center"/>
+            <w:hideMark/>
+          </w:tcPr>
+          <w:p>
+            <w:pPr>
+              <w:rPr>
+                <w:szCs w:val="28"/>
+              </w:rPr>
+            </w:pPr>
+            <w:r>
+              <w:rPr>
+                <w:szCs w:val="28"/>
+              </w:rPr>
+              <w:t>High</w:t>
+            </w:r>
+          </w:p>
+        </w:tc>
+      </w:tr>
+      <w:tr>
+        <w:trPr>
+          <w:tblCellSpacing w:w="15" w:type="dxa"/>
+        </w:trPr>
+        <w:tc>
+          <w:tcPr>
+            <w:tcW w:w="1231" w:type="dxa"/>
+            <w:vAlign w:val="center"/>
+            <w:hideMark/>
+          </w:tcPr>
+          <w:p>
+            <w:pPr>
+              <w:rPr>
+                <w:szCs w:val="28"/>
+              </w:rPr>
+            </w:pPr>
+            <w:r>
+              <w:rPr>
+                <w:szCs w:val="28"/>
+              </w:rPr>
+              <w:t>FR-05</w:t>
+            </w:r>
+          </w:p>
+        </w:tc>
+        <w:tc>
+          <w:tcPr>
+            <w:tcW w:w="8475" w:type="dxa"/>
+            <w:vAlign w:val="center"/>
+            <w:hideMark/>
+          </w:tcPr>
+          <w:p>
+            <w:pPr>
+              <w:rPr>
+                <w:szCs w:val="28"/>
+              </w:rPr>
+            </w:pPr>
+            <w:r>
+              <w:rPr>
+                <w:szCs w:val="28"/>
+              </w:rPr>
+              <w:t>The system shall allow users to edit and delete their own tasks.</w:t>
+            </w:r>
+          </w:p>
+        </w:tc>
+        <w:tc>
+          <w:tcPr>
+            <w:tcW w:w="947" w:type="dxa"/>
+            <w:vAlign w:val="center"/>
+            <w:hideMark/>
+          </w:tcPr>
+          <w:p>
+            <w:pPr>
+              <w:rPr>
+                <w:szCs w:val="28"/>
+              </w:rPr>
+            </w:pPr>
+            <w:r>
+              <w:rPr>
+                <w:szCs w:val="28"/>
+              </w:rPr>
+              <w:t>High</w:t>
+            </w:r>
+          </w:p>
+        </w:tc>
+      </w:tr>
+      <w:tr>
+        <w:trPr>
+          <w:tblCellSpacing w:w="15" w:type="dxa"/>
+        </w:trPr>
+        <w:tc>
+          <w:tcPr>
+            <w:tcW w:w="1231" w:type="dxa"/>
+            <w:vAlign w:val="center"/>
+            <w:hideMark/>
+          </w:tcPr>
+          <w:p>
+            <w:pPr>
+              <w:rPr>
+                <w:szCs w:val="28"/>
+              </w:rPr>
+            </w:pPr>
+            <w:r>
+              <w:rPr>
+                <w:szCs w:val="28"/>
+              </w:rPr>
+              <w:t>FR-06</w:t>
+            </w:r>
+          </w:p>
+        </w:tc>
+        <w:tc>
+          <w:tcPr>
+            <w:tcW w:w="8475" w:type="dxa"/>
+            <w:vAlign w:val="center"/>
+            <w:hideMark/>
+          </w:tcPr>
+          <w:p>
+            <w:pPr>
+              <w:rPr>
+                <w:szCs w:val="28"/>
+              </w:rPr>
+            </w:pPr>
+            <w:r>
+              <w:rPr>
+                <w:szCs w:val="28"/>
+              </w:rPr>
+              <w:t>The system shall allow task statuses to be set as Pending, In Progress, or Completed.</w:t>
+            </w:r>
+          </w:p>
+        </w:tc>
+        <w:tc>
+          <w:tcPr>
+            <w:tcW w:w="947" w:type="dxa"/>
+            <w:vAlign w:val="center"/>
+            <w:hideMark/>
+          </w:tcPr>
+          <w:p>
+            <w:pPr>
+              <w:rPr>
+                <w:szCs w:val="28"/>
+              </w:rPr>
+            </w:pPr>
+            <w:r>
+              <w:rPr>
+                <w:szCs w:val="28"/>
+              </w:rPr>
+              <w:t>High</w:t>
+            </w:r>
+          </w:p>
+        </w:tc>
+      </w:tr>
+      <w:tr>
+        <w:trPr>
+          <w:tblCellSpacing w:w="15" w:type="dxa"/>
+        </w:trPr>
+        <w:tc>
+          <w:tcPr>
+            <w:tcW w:w="1231" w:type="dxa"/>
+            <w:vAlign w:val="center"/>
+            <w:hideMark/>
+          </w:tcPr>
+          <w:p>
+            <w:pPr>
+              <w:rPr>
+                <w:szCs w:val="28"/>
+              </w:rPr>
+            </w:pPr>
+            <w:r>
+              <w:rPr>
+                <w:szCs w:val="28"/>
+              </w:rPr>
+              <w:t>FR-07</w:t>
+            </w:r>
+          </w:p>
+        </w:tc>
+        <w:tc>
+          <w:tcPr>
+            <w:tcW w:w="8475" w:type="dxa"/>
+            <w:vAlign w:val="center"/>
+            <w:hideMark/>
+          </w:tcPr>
+          <w:p>
+            <w:pPr>
+              <w:rPr>
+                <w:szCs w:val="28"/>
+              </w:rPr>
+            </w:pPr>
+            <w:r>
+              <w:rPr>
+                <w:szCs w:val="28"/>
+              </w:rPr>
+              <w:t>The system shall identify tasks that are overdue and not completed.</w:t>
+            </w:r>
+          </w:p>
+        </w:tc>
+        <w:tc>
+          <w:tcPr>
+            <w:tcW w:w="947" w:type="dxa"/>
+            <w:vAlign w:val="center"/>
+            <w:hideMark/>
+          </w:tcPr>
+          <w:p>
+            <w:pPr>
+              <w:rPr>
+                <w:szCs w:val="28"/>
+              </w:rPr>
+            </w:pPr>
+            <w:r>
+              <w:rPr>
+                <w:szCs w:val="28"/>
+              </w:rPr>
+              <w:t>High</w:t>
+            </w:r>
+          </w:p>
+        </w:tc>
+      </w:tr>
+      <w:tr>
+        <w:trPr>
+          <w:tblCellSpacing w:w="15" w:type="dxa"/>
+        </w:trPr>
+        <w:tc>
+          <w:tcPr>
+            <w:tcW w:w="1231" w:type="dxa"/>
+            <w:vAlign w:val="center"/>
+            <w:hideMark/>
+          </w:tcPr>
+          <w:p>
+            <w:pPr>
+              <w:rPr>
+                <w:szCs w:val="28"/>
+              </w:rPr>
+            </w:pPr>
+            <w:r>
+              <w:rPr>
+                <w:szCs w:val="28"/>
+              </w:rPr>
+              <w:t>FR-08</w:t>
+            </w:r>
+          </w:p>
+        </w:tc>
+        <w:tc>
+          <w:tcPr>
+            <w:tcW w:w="8475" w:type="dxa"/>
+            <w:vAlign w:val="center"/>
+            <w:hideMark/>
+          </w:tcPr>
+          <w:p>
+            <w:pPr>
+              <w:rPr>
+                <w:szCs w:val="28"/>
+              </w:rPr>
+            </w:pPr>
+            <w:r>
+              <w:rPr>
+                <w:szCs w:val="28"/>
+              </w:rPr>
+              <w:t>The system shall display total, pending, completed, and overdue task counts on the dashboard.</w:t>
+            </w:r>
+          </w:p>
+        </w:tc>
+        <w:tc>
+          <w:tcPr>
+            <w:tcW w:w="947" w:type="dxa"/>
+            <w:vAlign w:val="center"/>
+            <w:hideMark/>
+          </w:tcPr>
+          <w:p>
+            <w:pPr>
+              <w:rPr>
+                <w:szCs w:val="28"/>
+              </w:rPr>
+            </w:pPr>
+            <w:r>
+              <w:rPr>
+                <w:szCs w:val="28"/>
+              </w:rPr>
+              <w:t>Medium</w:t>
+            </w:r>
+          </w:p>
+        </w:tc>
+      </w:tr>
+      <w:tr>
+        <w:trPr>
+          <w:tblCellSpacing w:w="15" w:type="dxa"/>
+        </w:trPr>
+        <w:tc>
+          <w:tcPr>
+            <w:tcW w:w="1231" w:type="dxa"/>
+            <w:vAlign w:val="center"/>
+            <w:hideMark/>
+          </w:tcPr>
+          <w:p>
+            <w:pPr>
+              <w:rPr>
+                <w:szCs w:val="28"/>
+              </w:rPr>
+            </w:pPr>
+            <w:r>
+              <w:rPr>
+                <w:szCs w:val="28"/>
+              </w:rPr>
+              <w:t>FR-09</w:t>
+            </w:r>
+          </w:p>
+        </w:tc>
+        <w:tc>
+          <w:tcPr>
+            <w:tcW w:w="8475" w:type="dxa"/>
+            <w:vAlign w:val="center"/>
+            <w:hideMark/>
+          </w:tcPr>
+          <w:p>
+            <w:pPr>
+              <w:rPr>
+                <w:szCs w:val="28"/>
+              </w:rPr>
+            </w:pPr>
+            <w:r>
+              <w:rPr>
+                <w:szCs w:val="28"/>
+              </w:rPr>
+              <w:t>The system shall allow users to filter tasks by subject, status, and priority.</w:t>
+            </w:r>
+          </w:p>
+        </w:tc>
+        <w:tc>
+          <w:tcPr>
+            <w:tcW w:w="947" w:type="dxa"/>
+            <w:vAlign w:val="center"/>
+            <w:hideMark/>
+          </w:tcPr>
+          <w:p>
+            <w:pPr>
+              <w:rPr>
+                <w:szCs w:val="28"/>
+              </w:rPr>
+            </w:pPr>
+            <w:r>
+              <w:rPr>
+                <w:szCs w:val="28"/>
+              </w:rPr>
+              <w:t>Medium</w:t>
+            </w:r>
+          </w:p>
+        </w:tc>
+      </w:tr>
+      <w:tr>
+        <w:trPr>
+          <w:tblCellSpacing w:w="15" w:type="dxa"/>
+        </w:trPr>
+        <w:tc>
+          <w:tcPr>
+            <w:tcW w:w="1231" w:type="dxa"/>
+            <w:vAlign w:val="center"/>
+            <w:hideMark/>
+          </w:tcPr>
+          <w:p>
+            <w:pPr>
+              <w:rPr>
+                <w:szCs w:val="28"/>
+              </w:rPr>
+            </w:pPr>
+            <w:r>
+              <w:rPr>
+                <w:szCs w:val="28"/>
+              </w:rPr>
+              <w:t>FR-10</w:t>
+            </w:r>
+          </w:p>
+        </w:tc>
+        <w:tc>
+          <w:tcPr>
+            <w:tcW w:w="8475" w:type="dxa"/>
+            <w:vAlign w:val="center"/>
+            <w:hideMark/>
+          </w:tcPr>
+          <w:p>
+            <w:pPr>
+              <w:rPr>
+                <w:szCs w:val="28"/>
+              </w:rPr>
+            </w:pPr>
+            <w:r>
+              <w:rPr>
+                <w:szCs w:val="28"/>
+              </w:rPr>
+              <w:t>The system shall save task data so it remains available after the application restarts.</w:t>
+            </w:r>
+          </w:p>
+        </w:tc>
+        <w:tc>
+          <w:tcPr>
+            <w:tcW w:w="947" w:type="dxa"/>
+            <w:vAlign w:val="center"/>
+            <w:hideMark/>
+          </w:tcPr>
+          <w:p>
+            <w:pPr>
+              <w:rPr>
+                <w:szCs w:val="28"/>
+              </w:rPr>
+            </w:pPr>
+            <w:r>
+              <w:rPr>
+                <w:szCs w:val="28"/>
+              </w:rPr>
+              <w:t>High</w:t>
+            </w:r>
+          </w:p>
+        </w:tc>
+      </w:tr>
+      <w:tr>
+        <w:trPr>
+          <w:tblCellSpacing w:w="15" w:type="dxa"/>
+        </w:trPr>
+        <w:tc>
+          <w:tcPr>
+            <w:tcW w:w="1231" w:type="dxa"/>
+            <w:vAlign w:val="center"/>
+            <w:hideMark/>
+          </w:tcPr>
+          <w:p>
+            <w:pPr>
+              <w:rPr>
+                <w:szCs w:val="28"/>
+              </w:rPr>
+            </w:pPr>
+            <w:r>
+              <w:rPr>
+                <w:szCs w:val="28"/>
+              </w:rPr>
+              <w:t>FR-11</w:t>
+            </w:r>
+          </w:p>
+        </w:tc>
+        <w:tc>
+          <w:tcPr>
+            <w:tcW w:w="8475" w:type="dxa"/>
+            <w:vAlign w:val="center"/>
+            <w:hideMark/>
+          </w:tcPr>
+          <w:p>
+            <w:pPr>
+              <w:rPr>
+                <w:szCs w:val="28"/>
+              </w:rPr>
+            </w:pPr>
+            <w:r>
+              <w:rPr>
+                <w:szCs w:val="28"/>
+              </w:rPr>
+              <w:t>The system shall prevent users from viewing or modifying another user's tasks.</w:t>
+            </w:r>
+          </w:p>
+        </w:tc>
+        <w:tc>
+          <w:tcPr>
+            <w:tcW w:w="947" w:type="dxa"/>
+            <w:vAlign w:val="center"/>
+            <w:hideMark/>
+          </w:tcPr>
+          <w:p>
+            <w:pPr>
+              <w:rPr>
+                <w:szCs w:val="28"/>
+              </w:rPr>
+            </w:pPr>
+            <w:r>
+              <w:rPr>
+                <w:szCs w:val="28"/>
+              </w:rPr>
+              <w:t>High</w:t>
+            </w:r>
+          </w:p>
+        </w:tc>
+      </w:tr>
+    </w:tbl>
+    <w:p>
+      <w:pPr>
+        <w:pStyle w:val="Heading1"/>
+        <w:rPr>
+          <w:sz w:val="16"/>
+          <w:szCs w:val="16"/>
+        </w:rPr>
+      </w:pPr>
+    </w:p>
+    <w:p>
+      <w:pPr>
+        <w:rPr>
+          <w:szCs w:val="28"/>
+        </w:rPr>
+      </w:pPr>
+    </w:p>
+    <w:p>
+      <w:pPr>
+        <w:pStyle w:val="Heading1"/>
+      </w:pPr>
+      <w:r>
+        <w:t>3.1 Business Rules</w:t>
+      </w:r>
+    </w:p>
+    <w:p/>
+    <w:p>
+      <w:pPr>
+        <w:numPr>
+          <w:ilvl w:val="0"/>
+          <w:numId w:val="8"/>
+        </w:numPr>
+        <w:rPr>
+          <w:sz w:val="24"/>
+          <w:szCs w:val="32"/>
+        </w:rPr>
+      </w:pPr>
+      <w:r>
+        <w:rPr>
+          <w:sz w:val="24"/>
+          <w:szCs w:val="32"/>
+        </w:rPr>
+        <w:t>Each task shall belong to one registered user.</w:t>
+      </w:r>
+    </w:p>
+    <w:p>
+      <w:pPr>
+        <w:numPr>
+          <w:ilvl w:val="0"/>
+          <w:numId w:val="8"/>
+        </w:numPr>
+        <w:rPr>
+          <w:sz w:val="24"/>
+          <w:szCs w:val="32"/>
+        </w:rPr>
+      </w:pPr>
+      <w:r>
+        <w:rPr>
+          <w:sz w:val="24"/>
+          <w:szCs w:val="32"/>
+        </w:rPr>
+        <w:t>A task shall be considered overdue when its due date has passed and its status is not Completed.</w:t>
+      </w:r>
+    </w:p>
+    <w:p>
+      <w:pPr>
+        <w:numPr>
+          <w:ilvl w:val="0"/>
+          <w:numId w:val="8"/>
+        </w:numPr>
+        <w:rPr>
+          <w:sz w:val="24"/>
+          <w:szCs w:val="32"/>
+        </w:rPr>
+      </w:pPr>
+      <w:r>
+        <w:rPr>
+          <w:sz w:val="24"/>
+          <w:szCs w:val="32"/>
+        </w:rPr>
+        <w:t>Required task fields shall be validated before saving.</w:t>
       </w:r>
     </w:p>
     <w:p>
@@ -895,6 +2003,119 @@
     </w:lvl>
   </w:abstractNum>
   <w:abstractNum w:abstractNumId="1" w15:restartNumberingAfterBreak="0">
+    <w:nsid w:val="1B5A7EC5"/>
+    <w:multiLevelType w:val="multilevel"/>
+    <w:tmpl w:val="5504E544"/>
+    <w:lvl w:ilvl="0">
+      <w:start w:val="1"/>
+      <w:numFmt w:val="decimal"/>
+      <w:lvlText w:val="%1."/>
+      <w:lvlJc w:val="left"/>
+      <w:pPr>
+        <w:tabs>
+          <w:tab w:val="num" w:pos="720"/>
+        </w:tabs>
+        <w:ind w:left="720" w:hanging="360"/>
+      </w:pPr>
+    </w:lvl>
+    <w:lvl w:ilvl="1" w:tentative="1">
+      <w:start w:val="1"/>
+      <w:numFmt w:val="decimal"/>
+      <w:lvlText w:val="%2."/>
+      <w:lvlJc w:val="left"/>
+      <w:pPr>
+        <w:tabs>
+          <w:tab w:val="num" w:pos="1440"/>
+        </w:tabs>
+        <w:ind w:left="1440" w:hanging="360"/>
+      </w:pPr>
+    </w:lvl>
+    <w:lvl w:ilvl="2" w:tentative="1">
+      <w:start w:val="1"/>
+      <w:numFmt w:val="decimal"/>
+      <w:lvlText w:val="%3."/>
+      <w:lvlJc w:val="left"/>
+      <w:pPr>
+        <w:tabs>
+          <w:tab w:val="num" w:pos="2160"/>
+        </w:tabs>
+        <w:ind w:left="2160" w:hanging="360"/>
+      </w:pPr>
+    </w:lvl>
+    <w:lvl w:ilvl="3" w:tentative="1">
+      <w:start w:val="1"/>
+      <w:numFmt w:val="decimal"/>
+      <w:lvlText w:val="%4."/>
+      <w:lvlJc w:val="left"/>
+      <w:pPr>
+        <w:tabs>
+          <w:tab w:val="num" w:pos="2880"/>
+        </w:tabs>
+        <w:ind w:left="2880" w:hanging="360"/>
+      </w:pPr>
+    </w:lvl>
+    <w:lvl w:ilvl="4" w:tentative="1">
+      <w:start w:val="1"/>
+      <w:numFmt w:val="decimal"/>
+      <w:lvlText w:val="%5."/>
+      <w:lvlJc w:val="left"/>
+      <w:pPr>
+        <w:tabs>
+          <w:tab w:val="num" w:pos="3600"/>
+        </w:tabs>
+        <w:ind w:left="3600" w:hanging="360"/>
+      </w:pPr>
+    </w:lvl>
+    <w:lvl w:ilvl="5" w:tentative="1">
+      <w:start w:val="1"/>
+      <w:numFmt w:val="decimal"/>
+      <w:lvlText w:val="%6."/>
+      <w:lvlJc w:val="left"/>
+      <w:pPr>
+        <w:tabs>
+          <w:tab w:val="num" w:pos="4320"/>
+        </w:tabs>
+        <w:ind w:left="4320" w:hanging="360"/>
+      </w:pPr>
+    </w:lvl>
+    <w:lvl w:ilvl="6" w:tentative="1">
+      <w:start w:val="1"/>
+      <w:numFmt w:val="decimal"/>
+      <w:lvlText w:val="%7."/>
+      <w:lvlJc w:val="left"/>
+      <w:pPr>
+        <w:tabs>
+          <w:tab w:val="num" w:pos="5040"/>
+        </w:tabs>
+        <w:ind w:left="5040" w:hanging="360"/>
+      </w:pPr>
+    </w:lvl>
+    <w:lvl w:ilvl="7" w:tentative="1">
+      <w:start w:val="1"/>
+      <w:numFmt w:val="decimal"/>
+      <w:lvlText w:val="%8."/>
+      <w:lvlJc w:val="left"/>
+      <w:pPr>
+        <w:tabs>
+          <w:tab w:val="num" w:pos="5760"/>
+        </w:tabs>
+        <w:ind w:left="5760" w:hanging="360"/>
+      </w:pPr>
+    </w:lvl>
+    <w:lvl w:ilvl="8" w:tentative="1">
+      <w:start w:val="1"/>
+      <w:numFmt w:val="decimal"/>
+      <w:lvlText w:val="%9."/>
+      <w:lvlJc w:val="left"/>
+      <w:pPr>
+        <w:tabs>
+          <w:tab w:val="num" w:pos="6480"/>
+        </w:tabs>
+        <w:ind w:left="6480" w:hanging="360"/>
+      </w:pPr>
+    </w:lvl>
+  </w:abstractNum>
+  <w:abstractNum w:abstractNumId="2" w15:restartNumberingAfterBreak="0">
     <w:nsid w:val="24A4577D"/>
     <w:multiLevelType w:val="multilevel"/>
     <w:tmpl w:val="371A5BE8"/>
@@ -1043,7 +2264,7 @@
       </w:rPr>
     </w:lvl>
   </w:abstractNum>
-  <w:abstractNum w:abstractNumId="2" w15:restartNumberingAfterBreak="0">
+  <w:abstractNum w:abstractNumId="3" w15:restartNumberingAfterBreak="0">
     <w:nsid w:val="27082986"/>
     <w:multiLevelType w:val="multilevel"/>
     <w:tmpl w:val="67B28A38"/>
@@ -1192,7 +2413,7 @@
       </w:rPr>
     </w:lvl>
   </w:abstractNum>
-  <w:abstractNum w:abstractNumId="3" w15:restartNumberingAfterBreak="0">
+  <w:abstractNum w:abstractNumId="4" w15:restartNumberingAfterBreak="0">
     <w:nsid w:val="2B203385"/>
     <w:multiLevelType w:val="multilevel"/>
     <w:tmpl w:val="41CE0564"/>
@@ -1341,7 +2562,7 @@
       </w:rPr>
     </w:lvl>
   </w:abstractNum>
-  <w:abstractNum w:abstractNumId="4" w15:restartNumberingAfterBreak="0">
+  <w:abstractNum w:abstractNumId="5" w15:restartNumberingAfterBreak="0">
     <w:nsid w:val="3C967DE9"/>
     <w:multiLevelType w:val="multilevel"/>
     <w:tmpl w:val="6100D102"/>
@@ -1490,7 +2711,7 @@
       </w:rPr>
     </w:lvl>
   </w:abstractNum>
-  <w:abstractNum w:abstractNumId="5" w15:restartNumberingAfterBreak="0">
+  <w:abstractNum w:abstractNumId="6" w15:restartNumberingAfterBreak="0">
     <w:nsid w:val="3D3D13BF"/>
     <w:multiLevelType w:val="hybridMultilevel"/>
     <w:tmpl w:val="E44E2742"/>
@@ -1579,7 +2800,7 @@
       </w:pPr>
     </w:lvl>
   </w:abstractNum>
-  <w:abstractNum w:abstractNumId="6" w15:restartNumberingAfterBreak="0">
+  <w:abstractNum w:abstractNumId="7" w15:restartNumberingAfterBreak="0">
     <w:nsid w:val="49D06547"/>
     <w:multiLevelType w:val="multilevel"/>
     <w:tmpl w:val="3364D1A4"/>
@@ -1729,25 +2950,28 @@
     </w:lvl>
   </w:abstractNum>
   <w:num w:numId="1" w16cid:durableId="60256711">
+    <w:abstractNumId w:val="3"/>
+  </w:num>
+  <w:num w:numId="2" w16cid:durableId="772438910">
     <w:abstractNumId w:val="2"/>
   </w:num>
-  <w:num w:numId="2" w16cid:durableId="772438910">
-    <w:abstractNumId w:val="1"/>
-  </w:num>
   <w:num w:numId="3" w16cid:durableId="493643719">
-    <w:abstractNumId w:val="3"/>
+    <w:abstractNumId w:val="4"/>
   </w:num>
   <w:num w:numId="4" w16cid:durableId="2043702296">
     <w:abstractNumId w:val="0"/>
   </w:num>
   <w:num w:numId="5" w16cid:durableId="1228568817">
+    <w:abstractNumId w:val="6"/>
+  </w:num>
+  <w:num w:numId="6" w16cid:durableId="2069497010">
     <w:abstractNumId w:val="5"/>
   </w:num>
-  <w:num w:numId="6" w16cid:durableId="2069497010">
-    <w:abstractNumId w:val="4"/>
+  <w:num w:numId="7" w16cid:durableId="192157585">
+    <w:abstractNumId w:val="7"/>
   </w:num>
-  <w:num w:numId="7" w16cid:durableId="192157585">
-    <w:abstractNumId w:val="6"/>
+  <w:num w:numId="8" w16cid:durableId="2080401065">
+    <w:abstractNumId w:val="1"/>
   </w:num>
 </w:numbering>
 </file>
@@ -1757,17 +2981,15 @@
   <w:docDefaults>
     <w:rPrDefault>
       <w:rPr>
-        <w:rFonts w:asciiTheme="minorHAnsi" w:eastAsiaTheme="minorHAnsi" w:hAnsiTheme="minorHAnsi" w:cstheme="minorBidi"/>
-        <w:kern w:val="2"/>
-        <w:sz w:val="24"/>
-        <w:szCs w:val="30"/>
+        <w:rFonts w:asciiTheme="minorHAnsi" w:eastAsiaTheme="minorEastAsia" w:hAnsiTheme="minorHAnsi" w:cstheme="minorBidi"/>
+        <w:sz w:val="22"/>
+        <w:szCs w:val="22"/>
         <w:lang w:val="en-US" w:eastAsia="en-US" w:bidi="th-TH"/>
-        <w14:ligatures w14:val="standardContextual"/>
       </w:rPr>
     </w:rPrDefault>
     <w:pPrDefault>
       <w:pPr>
-        <w:spacing w:after="160" w:line="278" w:lineRule="auto"/>
+        <w:spacing w:after="160" w:line="259" w:lineRule="auto"/>
       </w:pPr>
     </w:pPrDefault>
   </w:docDefaults>
@@ -2152,6 +3374,7 @@
   <w:style w:type="paragraph" w:default="1" w:styleId="Normal">
     <w:name w:val="Normal"/>
     <w:qFormat/>
+    <w:rsid w:val="005622CF"/>
   </w:style>
   <w:style w:type="paragraph" w:styleId="Heading1">
     <w:name w:val="heading 1"/>
@@ -2160,18 +3383,18 @@
     <w:link w:val="Heading1Char"/>
     <w:uiPriority w:val="9"/>
     <w:qFormat/>
-    <w:rsid w:val="00FA121E"/>
+    <w:rsid w:val="005622CF"/>
     <w:pPr>
       <w:keepNext/>
       <w:keepLines/>
-      <w:spacing w:before="360" w:after="80"/>
+      <w:spacing w:before="240" w:after="0"/>
       <w:outlineLvl w:val="0"/>
     </w:pPr>
     <w:rPr>
       <w:rFonts w:asciiTheme="majorHAnsi" w:eastAsiaTheme="majorEastAsia" w:hAnsiTheme="majorHAnsi" w:cstheme="majorBidi"/>
-      <w:color w:val="0F4761" w:themeColor="accent1" w:themeShade="BF"/>
-      <w:sz w:val="40"/>
-      <w:szCs w:val="50"/>
+      <w:color w:val="262626" w:themeColor="text1" w:themeTint="D9"/>
+      <w:sz w:val="32"/>
+      <w:szCs w:val="32"/>
     </w:rPr>
   </w:style>
   <w:style w:type="paragraph" w:styleId="Heading2">
@@ -2182,18 +3405,18 @@
     <w:uiPriority w:val="9"/>
     <w:unhideWhenUsed/>
     <w:qFormat/>
-    <w:rsid w:val="00FA121E"/>
+    <w:rsid w:val="005622CF"/>
     <w:pPr>
       <w:keepNext/>
       <w:keepLines/>
-      <w:spacing w:before="160" w:after="80"/>
+      <w:spacing w:before="40" w:after="0"/>
       <w:outlineLvl w:val="1"/>
     </w:pPr>
     <w:rPr>
       <w:rFonts w:asciiTheme="majorHAnsi" w:eastAsiaTheme="majorEastAsia" w:hAnsiTheme="majorHAnsi" w:cstheme="majorBidi"/>
-      <w:color w:val="0F4761" w:themeColor="accent1" w:themeShade="BF"/>
-      <w:sz w:val="32"/>
-      <w:szCs w:val="40"/>
+      <w:color w:val="262626" w:themeColor="text1" w:themeTint="D9"/>
+      <w:sz w:val="28"/>
+      <w:szCs w:val="28"/>
     </w:rPr>
   </w:style>
   <w:style w:type="paragraph" w:styleId="Heading3">
@@ -2204,18 +3427,18 @@
     <w:uiPriority w:val="9"/>
     <w:unhideWhenUsed/>
     <w:qFormat/>
-    <w:rsid w:val="00FA121E"/>
+    <w:rsid w:val="005622CF"/>
     <w:pPr>
       <w:keepNext/>
       <w:keepLines/>
-      <w:spacing w:before="160" w:after="80"/>
+      <w:spacing w:before="40" w:after="0"/>
       <w:outlineLvl w:val="2"/>
     </w:pPr>
     <w:rPr>
-      <w:rFonts w:eastAsiaTheme="majorEastAsia" w:cstheme="majorBidi"/>
-      <w:color w:val="0F4761" w:themeColor="accent1" w:themeShade="BF"/>
-      <w:sz w:val="28"/>
-      <w:szCs w:val="35"/>
+      <w:rFonts w:asciiTheme="majorHAnsi" w:eastAsiaTheme="majorEastAsia" w:hAnsiTheme="majorHAnsi" w:cstheme="majorBidi"/>
+      <w:color w:val="0D0D0D" w:themeColor="text1" w:themeTint="F2"/>
+      <w:sz w:val="24"/>
+      <w:szCs w:val="24"/>
     </w:rPr>
   </w:style>
   <w:style w:type="paragraph" w:styleId="Heading4">
@@ -2227,18 +3450,16 @@
     <w:semiHidden/>
     <w:unhideWhenUsed/>
     <w:qFormat/>
-    <w:rsid w:val="00FA121E"/>
+    <w:rsid w:val="005622CF"/>
     <w:pPr>
       <w:keepNext/>
       <w:keepLines/>
-      <w:spacing w:before="80" w:after="40"/>
+      <w:spacing w:before="40" w:after="0"/>
       <w:outlineLvl w:val="3"/>
     </w:pPr>
     <w:rPr>
-      <w:rFonts w:eastAsiaTheme="majorEastAsia" w:cstheme="majorBidi"/>
       <w:i/>
       <w:iCs/>
-      <w:color w:val="0F4761" w:themeColor="accent1" w:themeShade="BF"/>
     </w:rPr>
   </w:style>
   <w:style w:type="paragraph" w:styleId="Heading5">
@@ -2250,16 +3471,15 @@
     <w:semiHidden/>
     <w:unhideWhenUsed/>
     <w:qFormat/>
-    <w:rsid w:val="00FA121E"/>
+    <w:rsid w:val="005622CF"/>
     <w:pPr>
       <w:keepNext/>
       <w:keepLines/>
-      <w:spacing w:before="80" w:after="40"/>
+      <w:spacing w:before="40" w:after="0"/>
       <w:outlineLvl w:val="4"/>
     </w:pPr>
     <w:rPr>
-      <w:rFonts w:eastAsiaTheme="majorEastAsia" w:cstheme="majorBidi"/>
-      <w:color w:val="0F4761" w:themeColor="accent1" w:themeShade="BF"/>
+      <w:color w:val="404040" w:themeColor="text1" w:themeTint="BF"/>
     </w:rPr>
   </w:style>
   <w:style w:type="paragraph" w:styleId="Heading6">
@@ -2271,19 +3491,13 @@
     <w:semiHidden/>
     <w:unhideWhenUsed/>
     <w:qFormat/>
-    <w:rsid w:val="00FA121E"/>
+    <w:rsid w:val="005622CF"/>
     <w:pPr>
       <w:keepNext/>
       <w:keepLines/>
       <w:spacing w:before="40" w:after="0"/>
       <w:outlineLvl w:val="5"/>
     </w:pPr>
-    <w:rPr>
-      <w:rFonts w:eastAsiaTheme="majorEastAsia" w:cstheme="majorBidi"/>
-      <w:i/>
-      <w:iCs/>
-      <w:color w:val="595959" w:themeColor="text1" w:themeTint="A6"/>
-    </w:rPr>
   </w:style>
   <w:style w:type="paragraph" w:styleId="Heading7">
     <w:name w:val="heading 7"/>
@@ -2294,7 +3508,7 @@
     <w:semiHidden/>
     <w:unhideWhenUsed/>
     <w:qFormat/>
-    <w:rsid w:val="00FA121E"/>
+    <w:rsid w:val="005622CF"/>
     <w:pPr>
       <w:keepNext/>
       <w:keepLines/>
@@ -2302,8 +3516,9 @@
       <w:outlineLvl w:val="6"/>
     </w:pPr>
     <w:rPr>
-      <w:rFonts w:eastAsiaTheme="majorEastAsia" w:cstheme="majorBidi"/>
-      <w:color w:val="595959" w:themeColor="text1" w:themeTint="A6"/>
+      <w:rFonts w:asciiTheme="majorHAnsi" w:eastAsiaTheme="majorEastAsia" w:hAnsiTheme="majorHAnsi" w:cstheme="majorBidi"/>
+      <w:i/>
+      <w:iCs/>
     </w:rPr>
   </w:style>
   <w:style w:type="paragraph" w:styleId="Heading8">
@@ -2315,18 +3530,17 @@
     <w:semiHidden/>
     <w:unhideWhenUsed/>
     <w:qFormat/>
-    <w:rsid w:val="00FA121E"/>
+    <w:rsid w:val="005622CF"/>
     <w:pPr>
       <w:keepNext/>
       <w:keepLines/>
-      <w:spacing w:after="0"/>
+      <w:spacing w:before="40" w:after="0"/>
       <w:outlineLvl w:val="7"/>
     </w:pPr>
     <w:rPr>
-      <w:rFonts w:eastAsiaTheme="majorEastAsia" w:cstheme="majorBidi"/>
-      <w:i/>
-      <w:iCs/>
-      <w:color w:val="272727" w:themeColor="text1" w:themeTint="D8"/>
+      <w:color w:val="262626" w:themeColor="text1" w:themeTint="D9"/>
+      <w:sz w:val="21"/>
+      <w:szCs w:val="21"/>
     </w:rPr>
   </w:style>
   <w:style w:type="paragraph" w:styleId="Heading9">
@@ -2338,16 +3552,20 @@
     <w:semiHidden/>
     <w:unhideWhenUsed/>
     <w:qFormat/>
-    <w:rsid w:val="00FA121E"/>
+    <w:rsid w:val="005622CF"/>
     <w:pPr>
       <w:keepNext/>
       <w:keepLines/>
-      <w:spacing w:after="0"/>
+      <w:spacing w:before="40" w:after="0"/>
       <w:outlineLvl w:val="8"/>
     </w:pPr>
     <w:rPr>
-      <w:rFonts w:eastAsiaTheme="majorEastAsia" w:cstheme="majorBidi"/>
-      <w:color w:val="272727" w:themeColor="text1" w:themeTint="D8"/>
+      <w:rFonts w:asciiTheme="majorHAnsi" w:eastAsiaTheme="majorEastAsia" w:hAnsiTheme="majorHAnsi" w:cstheme="majorBidi"/>
+      <w:i/>
+      <w:iCs/>
+      <w:color w:val="262626" w:themeColor="text1" w:themeTint="D9"/>
+      <w:sz w:val="21"/>
+      <w:szCs w:val="21"/>
     </w:rPr>
   </w:style>
   <w:style w:type="character" w:default="1" w:styleId="DefaultParagraphFont">
@@ -2381,12 +3599,12 @@
     <w:basedOn w:val="DefaultParagraphFont"/>
     <w:link w:val="Heading1"/>
     <w:uiPriority w:val="9"/>
-    <w:rsid w:val="00FA121E"/>
+    <w:rsid w:val="005622CF"/>
     <w:rPr>
       <w:rFonts w:asciiTheme="majorHAnsi" w:eastAsiaTheme="majorEastAsia" w:hAnsiTheme="majorHAnsi" w:cstheme="majorBidi"/>
-      <w:color w:val="0F4761" w:themeColor="accent1" w:themeShade="BF"/>
-      <w:sz w:val="40"/>
-      <w:szCs w:val="50"/>
+      <w:color w:val="262626" w:themeColor="text1" w:themeTint="D9"/>
+      <w:sz w:val="32"/>
+      <w:szCs w:val="32"/>
     </w:rPr>
   </w:style>
   <w:style w:type="character" w:customStyle="1" w:styleId="Heading2Char">
@@ -2394,12 +3612,12 @@
     <w:basedOn w:val="DefaultParagraphFont"/>
     <w:link w:val="Heading2"/>
     <w:uiPriority w:val="9"/>
-    <w:rsid w:val="00FA121E"/>
+    <w:rsid w:val="005622CF"/>
     <w:rPr>
       <w:rFonts w:asciiTheme="majorHAnsi" w:eastAsiaTheme="majorEastAsia" w:hAnsiTheme="majorHAnsi" w:cstheme="majorBidi"/>
-      <w:color w:val="0F4761" w:themeColor="accent1" w:themeShade="BF"/>
-      <w:sz w:val="32"/>
-      <w:szCs w:val="40"/>
+      <w:color w:val="262626" w:themeColor="text1" w:themeTint="D9"/>
+      <w:sz w:val="28"/>
+      <w:szCs w:val="28"/>
     </w:rPr>
   </w:style>
   <w:style w:type="character" w:customStyle="1" w:styleId="Heading3Char">
@@ -2407,12 +3625,12 @@
     <w:basedOn w:val="DefaultParagraphFont"/>
     <w:link w:val="Heading3"/>
     <w:uiPriority w:val="9"/>
-    <w:rsid w:val="00FA121E"/>
+    <w:rsid w:val="005622CF"/>
     <w:rPr>
-      <w:rFonts w:eastAsiaTheme="majorEastAsia" w:cstheme="majorBidi"/>
-      <w:color w:val="0F4761" w:themeColor="accent1" w:themeShade="BF"/>
-      <w:sz w:val="28"/>
-      <w:szCs w:val="35"/>
+      <w:rFonts w:asciiTheme="majorHAnsi" w:eastAsiaTheme="majorEastAsia" w:hAnsiTheme="majorHAnsi" w:cstheme="majorBidi"/>
+      <w:color w:val="0D0D0D" w:themeColor="text1" w:themeTint="F2"/>
+      <w:sz w:val="24"/>
+      <w:szCs w:val="24"/>
     </w:rPr>
   </w:style>
   <w:style w:type="character" w:customStyle="1" w:styleId="Heading4Char">
@@ -2421,12 +3639,10 @@
     <w:link w:val="Heading4"/>
     <w:uiPriority w:val="9"/>
     <w:semiHidden/>
-    <w:rsid w:val="00FA121E"/>
+    <w:rsid w:val="005622CF"/>
     <w:rPr>
-      <w:rFonts w:eastAsiaTheme="majorEastAsia" w:cstheme="majorBidi"/>
       <w:i/>
       <w:iCs/>
-      <w:color w:val="0F4761" w:themeColor="accent1" w:themeShade="BF"/>
     </w:rPr>
   </w:style>
   <w:style w:type="character" w:customStyle="1" w:styleId="Heading5Char">
@@ -2435,10 +3651,9 @@
     <w:link w:val="Heading5"/>
     <w:uiPriority w:val="9"/>
     <w:semiHidden/>
-    <w:rsid w:val="00FA121E"/>
+    <w:rsid w:val="005622CF"/>
     <w:rPr>
-      <w:rFonts w:eastAsiaTheme="majorEastAsia" w:cstheme="majorBidi"/>
-      <w:color w:val="0F4761" w:themeColor="accent1" w:themeShade="BF"/>
+      <w:color w:val="404040" w:themeColor="text1" w:themeTint="BF"/>
     </w:rPr>
   </w:style>
   <w:style w:type="character" w:customStyle="1" w:styleId="Heading6Char">
@@ -2447,13 +3662,7 @@
     <w:link w:val="Heading6"/>
     <w:uiPriority w:val="9"/>
     <w:semiHidden/>
-    <w:rsid w:val="00FA121E"/>
-    <w:rPr>
-      <w:rFonts w:eastAsiaTheme="majorEastAsia" w:cstheme="majorBidi"/>
-      <w:i/>
-      <w:iCs/>
-      <w:color w:val="595959" w:themeColor="text1" w:themeTint="A6"/>
-    </w:rPr>
+    <w:rsid w:val="005622CF"/>
   </w:style>
   <w:style w:type="character" w:customStyle="1" w:styleId="Heading7Char">
     <w:name w:val="Heading 7 Char"/>
@@ -2461,10 +3670,11 @@
     <w:link w:val="Heading7"/>
     <w:uiPriority w:val="9"/>
     <w:semiHidden/>
-    <w:rsid w:val="00FA121E"/>
+    <w:rsid w:val="005622CF"/>
     <w:rPr>
-      <w:rFonts w:eastAsiaTheme="majorEastAsia" w:cstheme="majorBidi"/>
-      <w:color w:val="595959" w:themeColor="text1" w:themeTint="A6"/>
+      <w:rFonts w:asciiTheme="majorHAnsi" w:eastAsiaTheme="majorEastAsia" w:hAnsiTheme="majorHAnsi" w:cstheme="majorBidi"/>
+      <w:i/>
+      <w:iCs/>
     </w:rPr>
   </w:style>
   <w:style w:type="character" w:customStyle="1" w:styleId="Heading8Char">
@@ -2473,12 +3683,11 @@
     <w:link w:val="Heading8"/>
     <w:uiPriority w:val="9"/>
     <w:semiHidden/>
-    <w:rsid w:val="00FA121E"/>
+    <w:rsid w:val="005622CF"/>
     <w:rPr>
-      <w:rFonts w:eastAsiaTheme="majorEastAsia" w:cstheme="majorBidi"/>
-      <w:i/>
-      <w:iCs/>
-      <w:color w:val="272727" w:themeColor="text1" w:themeTint="D8"/>
+      <w:color w:val="262626" w:themeColor="text1" w:themeTint="D9"/>
+      <w:sz w:val="21"/>
+      <w:szCs w:val="21"/>
     </w:rPr>
   </w:style>
   <w:style w:type="character" w:customStyle="1" w:styleId="Heading9Char">
@@ -2487,10 +3696,14 @@
     <w:link w:val="Heading9"/>
     <w:uiPriority w:val="9"/>
     <w:semiHidden/>
-    <w:rsid w:val="00FA121E"/>
+    <w:rsid w:val="005622CF"/>
     <w:rPr>
-      <w:rFonts w:eastAsiaTheme="majorEastAsia" w:cstheme="majorBidi"/>
-      <w:color w:val="272727" w:themeColor="text1" w:themeTint="D8"/>
+      <w:rFonts w:asciiTheme="majorHAnsi" w:eastAsiaTheme="majorEastAsia" w:hAnsiTheme="majorHAnsi" w:cstheme="majorBidi"/>
+      <w:i/>
+      <w:iCs/>
+      <w:color w:val="262626" w:themeColor="text1" w:themeTint="D9"/>
+      <w:sz w:val="21"/>
+      <w:szCs w:val="21"/>
     </w:rPr>
   </w:style>
   <w:style w:type="paragraph" w:styleId="Title">
@@ -2500,17 +3713,16 @@
     <w:link w:val="TitleChar"/>
     <w:uiPriority w:val="10"/>
     <w:qFormat/>
-    <w:rsid w:val="00FA121E"/>
+    <w:rsid w:val="005622CF"/>
     <w:pPr>
-      <w:spacing w:after="80" w:line="240" w:lineRule="auto"/>
+      <w:spacing w:after="0" w:line="240" w:lineRule="auto"/>
       <w:contextualSpacing/>
     </w:pPr>
     <w:rPr>
       <w:rFonts w:asciiTheme="majorHAnsi" w:eastAsiaTheme="majorEastAsia" w:hAnsiTheme="majorHAnsi" w:cstheme="majorBidi"/>
       <w:spacing w:val="-10"/>
-      <w:kern w:val="28"/>
       <w:sz w:val="56"/>
-      <w:szCs w:val="71"/>
+      <w:szCs w:val="56"/>
     </w:rPr>
   </w:style>
   <w:style w:type="character" w:customStyle="1" w:styleId="TitleChar">
@@ -2518,13 +3730,12 @@
     <w:basedOn w:val="DefaultParagraphFont"/>
     <w:link w:val="Title"/>
     <w:uiPriority w:val="10"/>
-    <w:rsid w:val="00FA121E"/>
+    <w:rsid w:val="005622CF"/>
     <w:rPr>
       <w:rFonts w:asciiTheme="majorHAnsi" w:eastAsiaTheme="majorEastAsia" w:hAnsiTheme="majorHAnsi" w:cstheme="majorBidi"/>
       <w:spacing w:val="-10"/>
-      <w:kern w:val="28"/>
       <w:sz w:val="56"/>
-      <w:szCs w:val="71"/>
+      <w:szCs w:val="56"/>
     </w:rPr>
   </w:style>
   <w:style w:type="paragraph" w:styleId="Subtitle">
@@ -2534,18 +3745,15 @@
     <w:link w:val="SubtitleChar"/>
     <w:uiPriority w:val="11"/>
     <w:qFormat/>
-    <w:rsid w:val="00FA121E"/>
+    <w:rsid w:val="005622CF"/>
     <w:pPr>
       <w:numPr>
         <w:ilvl w:val="1"/>
       </w:numPr>
     </w:pPr>
     <w:rPr>
-      <w:rFonts w:eastAsiaTheme="majorEastAsia" w:cstheme="majorBidi"/>
-      <w:color w:val="595959" w:themeColor="text1" w:themeTint="A6"/>
+      <w:color w:val="5A5A5A" w:themeColor="text1" w:themeTint="A5"/>
       <w:spacing w:val="15"/>
-      <w:sz w:val="28"/>
-      <w:szCs w:val="35"/>
     </w:rPr>
   </w:style>
   <w:style w:type="character" w:customStyle="1" w:styleId="SubtitleChar">
@@ -2553,13 +3761,10 @@
     <w:basedOn w:val="DefaultParagraphFont"/>
     <w:link w:val="Subtitle"/>
     <w:uiPriority w:val="11"/>
-    <w:rsid w:val="00FA121E"/>
+    <w:rsid w:val="005622CF"/>
     <w:rPr>
-      <w:rFonts w:eastAsiaTheme="majorEastAsia" w:cstheme="majorBidi"/>
-      <w:color w:val="595959" w:themeColor="text1" w:themeTint="A6"/>
+      <w:color w:val="5A5A5A" w:themeColor="text1" w:themeTint="A5"/>
       <w:spacing w:val="15"/>
-      <w:sz w:val="28"/>
-      <w:szCs w:val="35"/>
     </w:rPr>
   </w:style>
   <w:style w:type="paragraph" w:styleId="Quote">
@@ -2569,10 +3774,10 @@
     <w:link w:val="QuoteChar"/>
     <w:uiPriority w:val="29"/>
     <w:qFormat/>
-    <w:rsid w:val="00FA121E"/>
+    <w:rsid w:val="005622CF"/>
     <w:pPr>
-      <w:spacing w:before="160"/>
-      <w:jc w:val="center"/>
+      <w:spacing w:before="200"/>
+      <w:ind w:left="864" w:right="864"/>
     </w:pPr>
     <w:rPr>
       <w:i/>
@@ -2585,7 +3790,7 @@
     <w:basedOn w:val="DefaultParagraphFont"/>
     <w:link w:val="Quote"/>
     <w:uiPriority w:val="29"/>
-    <w:rsid w:val="00FA121E"/>
+    <w:rsid w:val="005622CF"/>
     <w:rPr>
       <w:i/>
       <w:iCs/>
@@ -2602,17 +3807,23 @@
       <w:ind w:left="720"/>
       <w:contextualSpacing/>
     </w:pPr>
+    <w:rPr>
+      <w:rFonts w:cs="Cordia New"/>
+      <w:szCs w:val="28"/>
+    </w:rPr>
   </w:style>
   <w:style w:type="character" w:styleId="IntenseEmphasis">
     <w:name w:val="Intense Emphasis"/>
     <w:basedOn w:val="DefaultParagraphFont"/>
     <w:uiPriority w:val="21"/>
     <w:qFormat/>
-    <w:rsid w:val="00FA121E"/>
+    <w:rsid w:val="005622CF"/>
     <w:rPr>
+      <w:b/>
+      <w:bCs/>
       <w:i/>
       <w:iCs/>
-      <w:color w:val="0F4761" w:themeColor="accent1" w:themeShade="BF"/>
+      <w:color w:val="auto"/>
     </w:rPr>
   </w:style>
   <w:style w:type="paragraph" w:styleId="IntenseQuote">
@@ -2622,11 +3833,11 @@
     <w:link w:val="IntenseQuoteChar"/>
     <w:uiPriority w:val="30"/>
     <w:qFormat/>
-    <w:rsid w:val="00FA121E"/>
+    <w:rsid w:val="005622CF"/>
     <w:pPr>
       <w:pBdr>
-        <w:top w:val="single" w:sz="4" w:space="10" w:color="0F4761" w:themeColor="accent1" w:themeShade="BF"/>
-        <w:bottom w:val="single" w:sz="4" w:space="10" w:color="0F4761" w:themeColor="accent1" w:themeShade="BF"/>
+        <w:top w:val="single" w:sz="4" w:space="10" w:color="404040" w:themeColor="text1" w:themeTint="BF"/>
+        <w:bottom w:val="single" w:sz="4" w:space="10" w:color="404040" w:themeColor="text1" w:themeTint="BF"/>
       </w:pBdr>
       <w:spacing w:before="360" w:after="360"/>
       <w:ind w:left="864" w:right="864"/>
@@ -2635,7 +3846,7 @@
     <w:rPr>
       <w:i/>
       <w:iCs/>
-      <w:color w:val="0F4761" w:themeColor="accent1" w:themeShade="BF"/>
+      <w:color w:val="404040" w:themeColor="text1" w:themeTint="BF"/>
     </w:rPr>
   </w:style>
   <w:style w:type="character" w:customStyle="1" w:styleId="IntenseQuoteChar">
@@ -2643,11 +3854,11 @@
     <w:basedOn w:val="DefaultParagraphFont"/>
     <w:link w:val="IntenseQuote"/>
     <w:uiPriority w:val="30"/>
-    <w:rsid w:val="00FA121E"/>
+    <w:rsid w:val="005622CF"/>
     <w:rPr>
       <w:i/>
       <w:iCs/>
-      <w:color w:val="0F4761" w:themeColor="accent1" w:themeShade="BF"/>
+      <w:color w:val="404040" w:themeColor="text1" w:themeTint="BF"/>
     </w:rPr>
   </w:style>
   <w:style w:type="character" w:styleId="IntenseReference">
@@ -2655,14 +3866,136 @@
     <w:basedOn w:val="DefaultParagraphFont"/>
     <w:uiPriority w:val="32"/>
     <w:qFormat/>
-    <w:rsid w:val="00FA121E"/>
+    <w:rsid w:val="005622CF"/>
     <w:rPr>
       <w:b/>
       <w:bCs/>
       <w:smallCaps/>
-      <w:color w:val="0F4761" w:themeColor="accent1" w:themeShade="BF"/>
+      <w:color w:val="404040" w:themeColor="text1" w:themeTint="BF"/>
       <w:spacing w:val="5"/>
     </w:rPr>
+  </w:style>
+  <w:style w:type="table" w:styleId="TableGrid">
+    <w:name w:val="Table Grid"/>
+    <w:basedOn w:val="TableNormal"/>
+    <w:uiPriority w:val="39"/>
+    <w:rsid w:val="000D75E4"/>
+    <w:pPr>
+      <w:spacing w:after="0" w:line="240" w:lineRule="auto"/>
+    </w:pPr>
+    <w:tblPr>
+      <w:tblBorders>
+        <w:top w:val="single" w:sz="4" w:space="0" w:color="auto"/>
+        <w:left w:val="single" w:sz="4" w:space="0" w:color="auto"/>
+        <w:bottom w:val="single" w:sz="4" w:space="0" w:color="auto"/>
+        <w:right w:val="single" w:sz="4" w:space="0" w:color="auto"/>
+        <w:insideH w:val="single" w:sz="4" w:space="0" w:color="auto"/>
+        <w:insideV w:val="single" w:sz="4" w:space="0" w:color="auto"/>
+      </w:tblBorders>
+    </w:tblPr>
+  </w:style>
+  <w:style w:type="paragraph" w:styleId="NoSpacing">
+    <w:name w:val="No Spacing"/>
+    <w:uiPriority w:val="1"/>
+    <w:qFormat/>
+    <w:rsid w:val="005622CF"/>
+    <w:pPr>
+      <w:spacing w:after="0" w:line="240" w:lineRule="auto"/>
+    </w:pPr>
+  </w:style>
+  <w:style w:type="paragraph" w:styleId="Caption">
+    <w:name w:val="caption"/>
+    <w:basedOn w:val="Normal"/>
+    <w:next w:val="Normal"/>
+    <w:uiPriority w:val="35"/>
+    <w:semiHidden/>
+    <w:unhideWhenUsed/>
+    <w:qFormat/>
+    <w:rsid w:val="005622CF"/>
+    <w:pPr>
+      <w:spacing w:after="200" w:line="240" w:lineRule="auto"/>
+    </w:pPr>
+    <w:rPr>
+      <w:i/>
+      <w:iCs/>
+      <w:color w:val="0E2841" w:themeColor="text2"/>
+      <w:sz w:val="18"/>
+      <w:szCs w:val="18"/>
+    </w:rPr>
+  </w:style>
+  <w:style w:type="character" w:styleId="Strong">
+    <w:name w:val="Strong"/>
+    <w:basedOn w:val="DefaultParagraphFont"/>
+    <w:uiPriority w:val="22"/>
+    <w:qFormat/>
+    <w:rsid w:val="005622CF"/>
+    <w:rPr>
+      <w:b/>
+      <w:bCs/>
+      <w:color w:val="auto"/>
+    </w:rPr>
+  </w:style>
+  <w:style w:type="character" w:styleId="Emphasis">
+    <w:name w:val="Emphasis"/>
+    <w:basedOn w:val="DefaultParagraphFont"/>
+    <w:uiPriority w:val="20"/>
+    <w:qFormat/>
+    <w:rsid w:val="005622CF"/>
+    <w:rPr>
+      <w:i/>
+      <w:iCs/>
+      <w:color w:val="auto"/>
+    </w:rPr>
+  </w:style>
+  <w:style w:type="character" w:styleId="SubtleEmphasis">
+    <w:name w:val="Subtle Emphasis"/>
+    <w:basedOn w:val="DefaultParagraphFont"/>
+    <w:uiPriority w:val="19"/>
+    <w:qFormat/>
+    <w:rsid w:val="005622CF"/>
+    <w:rPr>
+      <w:i/>
+      <w:iCs/>
+      <w:color w:val="404040" w:themeColor="text1" w:themeTint="BF"/>
+    </w:rPr>
+  </w:style>
+  <w:style w:type="character" w:styleId="SubtleReference">
+    <w:name w:val="Subtle Reference"/>
+    <w:basedOn w:val="DefaultParagraphFont"/>
+    <w:uiPriority w:val="31"/>
+    <w:qFormat/>
+    <w:rsid w:val="005622CF"/>
+    <w:rPr>
+      <w:smallCaps/>
+      <w:color w:val="404040" w:themeColor="text1" w:themeTint="BF"/>
+    </w:rPr>
+  </w:style>
+  <w:style w:type="character" w:styleId="BookTitle">
+    <w:name w:val="Book Title"/>
+    <w:basedOn w:val="DefaultParagraphFont"/>
+    <w:uiPriority w:val="33"/>
+    <w:qFormat/>
+    <w:rsid w:val="005622CF"/>
+    <w:rPr>
+      <w:b/>
+      <w:bCs/>
+      <w:i/>
+      <w:iCs/>
+      <w:spacing w:val="5"/>
+    </w:rPr>
+  </w:style>
+  <w:style w:type="paragraph" w:styleId="TOCHeading">
+    <w:name w:val="TOC Heading"/>
+    <w:basedOn w:val="Heading1"/>
+    <w:next w:val="Normal"/>
+    <w:uiPriority w:val="39"/>
+    <w:semiHidden/>
+    <w:unhideWhenUsed/>
+    <w:qFormat/>
+    <w:rsid w:val="005622CF"/>
+    <w:pPr>
+      <w:outlineLvl w:val="9"/>
+    </w:pPr>
   </w:style>
 </w:styles>
 </file>

</xml_diff>

<commit_message>
docs: add non-functional requirements
</commit_message>
<xml_diff>
--- a/02_SRS/StudyFlow_SRS_v1.0.docx.docx
+++ b/02_SRS/StudyFlow_SRS_v1.0.docx.docx
@@ -1837,7 +1837,710 @@
     <w:p>
       <w:pPr>
         <w:rPr>
+          <w:sz w:val="24"/>
+          <w:szCs w:val="32"/>
+        </w:rPr>
+      </w:pPr>
+      <w:r>
+        <w:rPr>
+          <w:sz w:val="24"/>
+          <w:szCs w:val="32"/>
+        </w:rPr>
+        <w:br w:type="page"/>
+      </w:r>
+    </w:p>
+    <w:p>
+      <w:pPr>
+        <w:pStyle w:val="Heading1"/>
+      </w:pPr>
+      <w:r>
+        <w:lastRenderedPageBreak/>
+        <w:t>4. NON-FUNCTIONAL REQUIREMENTS</w:t>
+      </w:r>
+    </w:p>
+    <w:p>
+      <w:pPr>
+        <w:pStyle w:val="NormalWeb"/>
+        <w:rPr>
+          <w:rFonts w:asciiTheme="majorHAnsi" w:hAnsiTheme="majorHAnsi"/>
+        </w:rPr>
+      </w:pPr>
+      <w:r>
+        <w:rPr>
+          <w:rFonts w:asciiTheme="majorHAnsi" w:hAnsiTheme="majorHAnsi"/>
+        </w:rPr>
+        <w:t xml:space="preserve">Non-functional requirements define the quality, performance, security, and reliability expected from </w:t>
+      </w:r>
+      <w:proofErr w:type="spellStart"/>
+      <w:r>
+        <w:rPr>
+          <w:rFonts w:asciiTheme="majorHAnsi" w:hAnsiTheme="majorHAnsi"/>
+        </w:rPr>
+        <w:t>StudyFlow</w:t>
+      </w:r>
+      <w:proofErr w:type="spellEnd"/>
+      <w:r>
+        <w:rPr>
+          <w:rFonts w:asciiTheme="majorHAnsi" w:hAnsiTheme="majorHAnsi"/>
+        </w:rPr>
+        <w:t>.</w:t>
+      </w:r>
+    </w:p>
+    <w:tbl>
+      <w:tblPr>
+        <w:tblW w:w="10091" w:type="dxa"/>
+        <w:tblCellSpacing w:w="15" w:type="dxa"/>
+        <w:tblInd w:w="-360" w:type="dxa"/>
+        <w:tblBorders>
+          <w:top w:val="single" w:sz="4" w:space="0" w:color="auto"/>
+          <w:left w:val="single" w:sz="4" w:space="0" w:color="auto"/>
+          <w:bottom w:val="single" w:sz="4" w:space="0" w:color="auto"/>
+          <w:right w:val="single" w:sz="4" w:space="0" w:color="auto"/>
+          <w:insideH w:val="single" w:sz="4" w:space="0" w:color="auto"/>
+          <w:insideV w:val="single" w:sz="4" w:space="0" w:color="auto"/>
+        </w:tblBorders>
+        <w:tblCellMar>
+          <w:top w:w="15" w:type="dxa"/>
+          <w:left w:w="15" w:type="dxa"/>
+          <w:bottom w:w="15" w:type="dxa"/>
+          <w:right w:w="15" w:type="dxa"/>
+        </w:tblCellMar>
+        <w:tblLook w:val="04A0" w:firstRow="1" w:lastRow="0" w:firstColumn="1" w:lastColumn="0" w:noHBand="0" w:noVBand="1"/>
+      </w:tblPr>
+      <w:tblGrid>
+        <w:gridCol w:w="1068"/>
+        <w:gridCol w:w="8151"/>
+        <w:gridCol w:w="872"/>
+      </w:tblGrid>
+      <w:tr>
+        <w:trPr>
+          <w:trHeight w:val="455"/>
+          <w:tblCellSpacing w:w="15" w:type="dxa"/>
+        </w:trPr>
+        <w:tc>
+          <w:tcPr>
+            <w:tcW w:w="1024" w:type="dxa"/>
+            <w:vAlign w:val="center"/>
+            <w:hideMark/>
+          </w:tcPr>
+          <w:p>
+            <w:pPr>
+              <w:rPr>
+                <w:b/>
+                <w:bCs/>
+                <w:szCs w:val="28"/>
+              </w:rPr>
+            </w:pPr>
+            <w:r>
+              <w:rPr>
+                <w:b/>
+                <w:bCs/>
+                <w:szCs w:val="28"/>
+              </w:rPr>
+              <w:t>ID</w:t>
+            </w:r>
+          </w:p>
+        </w:tc>
+        <w:tc>
+          <w:tcPr>
+            <w:tcW w:w="8140" w:type="dxa"/>
+            <w:vAlign w:val="center"/>
+            <w:hideMark/>
+          </w:tcPr>
+          <w:p>
+            <w:pPr>
+              <w:rPr>
+                <w:b/>
+                <w:bCs/>
+                <w:szCs w:val="28"/>
+              </w:rPr>
+            </w:pPr>
+            <w:r>
+              <w:rPr>
+                <w:b/>
+                <w:bCs/>
+                <w:szCs w:val="28"/>
+              </w:rPr>
+              <w:t>Requirement</w:t>
+            </w:r>
+          </w:p>
+        </w:tc>
+        <w:tc>
+          <w:tcPr>
+            <w:tcW w:w="807" w:type="dxa"/>
+            <w:vAlign w:val="center"/>
+            <w:hideMark/>
+          </w:tcPr>
+          <w:p>
+            <w:pPr>
+              <w:rPr>
+                <w:b/>
+                <w:bCs/>
+                <w:szCs w:val="28"/>
+              </w:rPr>
+            </w:pPr>
+            <w:r>
+              <w:rPr>
+                <w:b/>
+                <w:bCs/>
+                <w:szCs w:val="28"/>
+              </w:rPr>
+              <w:t>Priority</w:t>
+            </w:r>
+          </w:p>
+        </w:tc>
+      </w:tr>
+      <w:tr>
+        <w:trPr>
+          <w:trHeight w:val="738"/>
+          <w:tblCellSpacing w:w="15" w:type="dxa"/>
+        </w:trPr>
+        <w:tc>
+          <w:tcPr>
+            <w:tcW w:w="1024" w:type="dxa"/>
+            <w:vAlign w:val="center"/>
+            <w:hideMark/>
+          </w:tcPr>
+          <w:p>
+            <w:pPr>
+              <w:rPr>
+                <w:szCs w:val="28"/>
+              </w:rPr>
+            </w:pPr>
+            <w:r>
+              <w:rPr>
+                <w:szCs w:val="28"/>
+              </w:rPr>
+              <w:t>NFR-01</w:t>
+            </w:r>
+          </w:p>
+        </w:tc>
+        <w:tc>
+          <w:tcPr>
+            <w:tcW w:w="8140" w:type="dxa"/>
+            <w:vAlign w:val="center"/>
+            <w:hideMark/>
+          </w:tcPr>
+          <w:p>
+            <w:pPr>
+              <w:rPr>
+                <w:szCs w:val="28"/>
+              </w:rPr>
+            </w:pPr>
+            <w:r>
+              <w:rPr>
+                <w:szCs w:val="28"/>
+              </w:rPr>
+              <w:t>The interface shall be simple and easy to navigate.</w:t>
+            </w:r>
+          </w:p>
+        </w:tc>
+        <w:tc>
+          <w:tcPr>
+            <w:tcW w:w="807" w:type="dxa"/>
+            <w:vAlign w:val="center"/>
+            <w:hideMark/>
+          </w:tcPr>
+          <w:p>
+            <w:pPr>
+              <w:rPr>
+                <w:szCs w:val="28"/>
+              </w:rPr>
+            </w:pPr>
+            <w:r>
+              <w:rPr>
+                <w:szCs w:val="28"/>
+              </w:rPr>
+              <w:t>High</w:t>
+            </w:r>
+          </w:p>
+        </w:tc>
+      </w:tr>
+      <w:tr>
+        <w:trPr>
+          <w:trHeight w:val="750"/>
+          <w:tblCellSpacing w:w="15" w:type="dxa"/>
+        </w:trPr>
+        <w:tc>
+          <w:tcPr>
+            <w:tcW w:w="1024" w:type="dxa"/>
+            <w:vAlign w:val="center"/>
+            <w:hideMark/>
+          </w:tcPr>
+          <w:p>
+            <w:pPr>
+              <w:rPr>
+                <w:szCs w:val="28"/>
+              </w:rPr>
+            </w:pPr>
+            <w:r>
+              <w:rPr>
+                <w:szCs w:val="28"/>
+              </w:rPr>
+              <w:t>NFR-02</w:t>
+            </w:r>
+          </w:p>
+        </w:tc>
+        <w:tc>
+          <w:tcPr>
+            <w:tcW w:w="8140" w:type="dxa"/>
+            <w:vAlign w:val="center"/>
+            <w:hideMark/>
+          </w:tcPr>
+          <w:p>
+            <w:pPr>
+              <w:rPr>
+                <w:szCs w:val="28"/>
+              </w:rPr>
+            </w:pPr>
+            <w:r>
+              <w:rPr>
+                <w:szCs w:val="28"/>
+              </w:rPr>
+              <w:t>Common operations shall respond within two seconds under normal local testing conditions.</w:t>
+            </w:r>
+          </w:p>
+        </w:tc>
+        <w:tc>
+          <w:tcPr>
+            <w:tcW w:w="807" w:type="dxa"/>
+            <w:vAlign w:val="center"/>
+            <w:hideMark/>
+          </w:tcPr>
+          <w:p>
+            <w:pPr>
+              <w:rPr>
+                <w:szCs w:val="28"/>
+              </w:rPr>
+            </w:pPr>
+            <w:r>
+              <w:rPr>
+                <w:szCs w:val="28"/>
+              </w:rPr>
+              <w:t>Medium</w:t>
+            </w:r>
+          </w:p>
+        </w:tc>
+      </w:tr>
+      <w:tr>
+        <w:trPr>
+          <w:trHeight w:val="750"/>
+          <w:tblCellSpacing w:w="15" w:type="dxa"/>
+        </w:trPr>
+        <w:tc>
+          <w:tcPr>
+            <w:tcW w:w="1024" w:type="dxa"/>
+            <w:vAlign w:val="center"/>
+            <w:hideMark/>
+          </w:tcPr>
+          <w:p>
+            <w:pPr>
+              <w:rPr>
+                <w:szCs w:val="28"/>
+              </w:rPr>
+            </w:pPr>
+            <w:r>
+              <w:rPr>
+                <w:szCs w:val="28"/>
+              </w:rPr>
+              <w:t>NFR-03</w:t>
+            </w:r>
+          </w:p>
+        </w:tc>
+        <w:tc>
+          <w:tcPr>
+            <w:tcW w:w="8140" w:type="dxa"/>
+            <w:vAlign w:val="center"/>
+            <w:hideMark/>
+          </w:tcPr>
+          <w:p>
+            <w:pPr>
+              <w:rPr>
+                <w:szCs w:val="28"/>
+              </w:rPr>
+            </w:pPr>
+            <w:r>
+              <w:rPr>
+                <w:szCs w:val="28"/>
+              </w:rPr>
+              <w:t>Saved tasks shall remain available after the application restarts.</w:t>
+            </w:r>
+          </w:p>
+        </w:tc>
+        <w:tc>
+          <w:tcPr>
+            <w:tcW w:w="807" w:type="dxa"/>
+            <w:vAlign w:val="center"/>
+            <w:hideMark/>
+          </w:tcPr>
+          <w:p>
+            <w:pPr>
+              <w:rPr>
+                <w:szCs w:val="28"/>
+              </w:rPr>
+            </w:pPr>
+            <w:r>
+              <w:rPr>
+                <w:szCs w:val="28"/>
+              </w:rPr>
+              <w:t>High</w:t>
+            </w:r>
+          </w:p>
+        </w:tc>
+      </w:tr>
+      <w:tr>
+        <w:trPr>
+          <w:trHeight w:val="738"/>
+          <w:tblCellSpacing w:w="15" w:type="dxa"/>
+        </w:trPr>
+        <w:tc>
+          <w:tcPr>
+            <w:tcW w:w="1024" w:type="dxa"/>
+            <w:vAlign w:val="center"/>
+            <w:hideMark/>
+          </w:tcPr>
+          <w:p>
+            <w:pPr>
+              <w:rPr>
+                <w:szCs w:val="28"/>
+              </w:rPr>
+            </w:pPr>
+            <w:r>
+              <w:rPr>
+                <w:szCs w:val="28"/>
+              </w:rPr>
+              <w:t>NFR-04</w:t>
+            </w:r>
+          </w:p>
+        </w:tc>
+        <w:tc>
+          <w:tcPr>
+            <w:tcW w:w="8140" w:type="dxa"/>
+            <w:vAlign w:val="center"/>
+            <w:hideMark/>
+          </w:tcPr>
+          <w:p>
+            <w:pPr>
+              <w:rPr>
+                <w:szCs w:val="28"/>
+              </w:rPr>
+            </w:pPr>
+            <w:r>
+              <w:rPr>
+                <w:szCs w:val="28"/>
+              </w:rPr>
+              <w:t>The code shall be organized into frontend, backend, and database components.</w:t>
+            </w:r>
+          </w:p>
+        </w:tc>
+        <w:tc>
+          <w:tcPr>
+            <w:tcW w:w="807" w:type="dxa"/>
+            <w:vAlign w:val="center"/>
+            <w:hideMark/>
+          </w:tcPr>
+          <w:p>
+            <w:pPr>
+              <w:rPr>
+                <w:szCs w:val="28"/>
+              </w:rPr>
+            </w:pPr>
+            <w:r>
+              <w:rPr>
+                <w:szCs w:val="28"/>
+              </w:rPr>
+              <w:t>High</w:t>
+            </w:r>
+          </w:p>
+        </w:tc>
+      </w:tr>
+      <w:tr>
+        <w:trPr>
+          <w:trHeight w:val="750"/>
+          <w:tblCellSpacing w:w="15" w:type="dxa"/>
+        </w:trPr>
+        <w:tc>
+          <w:tcPr>
+            <w:tcW w:w="1024" w:type="dxa"/>
+            <w:vAlign w:val="center"/>
+            <w:hideMark/>
+          </w:tcPr>
+          <w:p>
+            <w:pPr>
+              <w:rPr>
+                <w:szCs w:val="28"/>
+              </w:rPr>
+            </w:pPr>
+            <w:r>
+              <w:rPr>
+                <w:szCs w:val="28"/>
+              </w:rPr>
+              <w:t>NFR-05</w:t>
+            </w:r>
+          </w:p>
+        </w:tc>
+        <w:tc>
+          <w:tcPr>
+            <w:tcW w:w="8140" w:type="dxa"/>
+            <w:vAlign w:val="center"/>
+            <w:hideMark/>
+          </w:tcPr>
+          <w:p>
+            <w:pPr>
+              <w:rPr>
+                <w:szCs w:val="28"/>
+              </w:rPr>
+            </w:pPr>
+            <w:r>
+              <w:rPr>
+                <w:szCs w:val="28"/>
+              </w:rPr>
+              <w:t>The system shall validate user inputs before saving data.</w:t>
+            </w:r>
+          </w:p>
+        </w:tc>
+        <w:tc>
+          <w:tcPr>
+            <w:tcW w:w="807" w:type="dxa"/>
+            <w:vAlign w:val="center"/>
+            <w:hideMark/>
+          </w:tcPr>
+          <w:p>
+            <w:pPr>
+              <w:rPr>
+                <w:szCs w:val="28"/>
+              </w:rPr>
+            </w:pPr>
+            <w:r>
+              <w:rPr>
+                <w:szCs w:val="28"/>
+              </w:rPr>
+              <w:t>High</w:t>
+            </w:r>
+          </w:p>
+        </w:tc>
+      </w:tr>
+      <w:tr>
+        <w:trPr>
+          <w:trHeight w:val="750"/>
+          <w:tblCellSpacing w:w="15" w:type="dxa"/>
+        </w:trPr>
+        <w:tc>
+          <w:tcPr>
+            <w:tcW w:w="1024" w:type="dxa"/>
+            <w:vAlign w:val="center"/>
+            <w:hideMark/>
+          </w:tcPr>
+          <w:p>
+            <w:pPr>
+              <w:rPr>
+                <w:szCs w:val="28"/>
+              </w:rPr>
+            </w:pPr>
+            <w:r>
+              <w:rPr>
+                <w:szCs w:val="28"/>
+              </w:rPr>
+              <w:t>NFR-06</w:t>
+            </w:r>
+          </w:p>
+        </w:tc>
+        <w:tc>
+          <w:tcPr>
+            <w:tcW w:w="8140" w:type="dxa"/>
+            <w:vAlign w:val="center"/>
+            <w:hideMark/>
+          </w:tcPr>
+          <w:p>
+            <w:pPr>
+              <w:rPr>
+                <w:szCs w:val="28"/>
+              </w:rPr>
+            </w:pPr>
+            <w:r>
+              <w:rPr>
+                <w:szCs w:val="28"/>
+              </w:rPr>
+              <w:t>The application shall work in a current, compatible desktop web browser.</w:t>
+            </w:r>
+          </w:p>
+        </w:tc>
+        <w:tc>
+          <w:tcPr>
+            <w:tcW w:w="807" w:type="dxa"/>
+            <w:vAlign w:val="center"/>
+            <w:hideMark/>
+          </w:tcPr>
+          <w:p>
+            <w:pPr>
+              <w:rPr>
+                <w:szCs w:val="28"/>
+              </w:rPr>
+            </w:pPr>
+            <w:r>
+              <w:rPr>
+                <w:szCs w:val="28"/>
+              </w:rPr>
+              <w:t>Medium</w:t>
+            </w:r>
+          </w:p>
+        </w:tc>
+      </w:tr>
+      <w:tr>
+        <w:trPr>
+          <w:trHeight w:val="738"/>
+          <w:tblCellSpacing w:w="15" w:type="dxa"/>
+        </w:trPr>
+        <w:tc>
+          <w:tcPr>
+            <w:tcW w:w="1024" w:type="dxa"/>
+            <w:vAlign w:val="center"/>
+            <w:hideMark/>
+          </w:tcPr>
+          <w:p>
+            <w:pPr>
+              <w:rPr>
+                <w:szCs w:val="28"/>
+              </w:rPr>
+            </w:pPr>
+            <w:r>
+              <w:rPr>
+                <w:szCs w:val="28"/>
+              </w:rPr>
+              <w:t>NFR-07</w:t>
+            </w:r>
+          </w:p>
+        </w:tc>
+        <w:tc>
+          <w:tcPr>
+            <w:tcW w:w="8140" w:type="dxa"/>
+            <w:vAlign w:val="center"/>
+            <w:hideMark/>
+          </w:tcPr>
+          <w:p>
+            <w:pPr>
+              <w:rPr>
+                <w:szCs w:val="28"/>
+              </w:rPr>
+            </w:pPr>
+            <w:r>
+              <w:rPr>
+                <w:szCs w:val="28"/>
+              </w:rPr>
+              <w:t>Passwords shall be hashed, and users shall only access their own tasks.</w:t>
+            </w:r>
+          </w:p>
+        </w:tc>
+        <w:tc>
+          <w:tcPr>
+            <w:tcW w:w="807" w:type="dxa"/>
+            <w:vAlign w:val="center"/>
+            <w:hideMark/>
+          </w:tcPr>
+          <w:p>
+            <w:pPr>
+              <w:rPr>
+                <w:szCs w:val="28"/>
+              </w:rPr>
+            </w:pPr>
+            <w:r>
+              <w:rPr>
+                <w:szCs w:val="28"/>
+              </w:rPr>
+              <w:t>High</w:t>
+            </w:r>
+          </w:p>
+        </w:tc>
+      </w:tr>
+    </w:tbl>
+    <w:p>
+      <w:pPr>
+        <w:rPr>
           <w:szCs w:val="28"/>
+        </w:rPr>
+      </w:pPr>
+    </w:p>
+    <w:p>
+      <w:pPr>
+        <w:rPr>
+          <w:szCs w:val="28"/>
+        </w:rPr>
+      </w:pPr>
+    </w:p>
+    <w:p>
+      <w:pPr>
+        <w:pStyle w:val="Heading1"/>
+      </w:pPr>
+    </w:p>
+    <w:p>
+      <w:pPr>
+        <w:pStyle w:val="Heading1"/>
+        <w:rPr>
+          <w:b/>
+          <w:bCs/>
+        </w:rPr>
+      </w:pPr>
+      <w:r>
+        <w:rPr>
+          <w:b/>
+          <w:bCs/>
+        </w:rPr>
+        <w:t>4.1 Acceptance Criteria</w:t>
+      </w:r>
+    </w:p>
+    <w:p/>
+    <w:p>
+      <w:pPr>
+        <w:rPr>
+          <w:sz w:val="24"/>
+          <w:szCs w:val="32"/>
+        </w:rPr>
+      </w:pPr>
+      <w:proofErr w:type="spellStart"/>
+      <w:proofErr w:type="gramStart"/>
+      <w:r>
+        <w:rPr>
+          <w:sz w:val="24"/>
+          <w:szCs w:val="32"/>
+        </w:rPr>
+        <w:t>StudyFlow</w:t>
+      </w:r>
+      <w:proofErr w:type="spellEnd"/>
+      <w:r>
+        <w:rPr>
+          <w:sz w:val="24"/>
+          <w:szCs w:val="32"/>
+        </w:rPr>
+        <w:t xml:space="preserve"> </w:t>
+      </w:r>
+      <w:r>
+        <w:rPr>
+          <w:sz w:val="24"/>
+          <w:szCs w:val="32"/>
+        </w:rPr>
+        <w:t xml:space="preserve"> </w:t>
+      </w:r>
+      <w:r>
+        <w:rPr>
+          <w:sz w:val="24"/>
+          <w:szCs w:val="32"/>
+        </w:rPr>
+        <w:t>will</w:t>
+      </w:r>
+      <w:proofErr w:type="gramEnd"/>
+      <w:r>
+        <w:rPr>
+          <w:sz w:val="24"/>
+          <w:szCs w:val="32"/>
+        </w:rPr>
+        <w:t xml:space="preserve"> be considered ready for demonstration when users can register and log in, manage their own academic tasks, update task statuses, identify overdue tasks, view dashboard summaries, and filter tasks. The system must also preserve saved data, validate inputs, and prevent unauthorized access to another user's tasks.</w:t>
+      </w:r>
+    </w:p>
+    <w:p>
+      <w:pPr>
+        <w:rPr>
+          <w:sz w:val="24"/>
+          <w:szCs w:val="32"/>
         </w:rPr>
       </w:pPr>
     </w:p>
@@ -3997,6 +4700,22 @@
       <w:outlineLvl w:val="9"/>
     </w:pPr>
   </w:style>
+  <w:style w:type="paragraph" w:styleId="NormalWeb">
+    <w:name w:val="Normal (Web)"/>
+    <w:basedOn w:val="Normal"/>
+    <w:uiPriority w:val="99"/>
+    <w:unhideWhenUsed/>
+    <w:rsid w:val="00D32E1B"/>
+    <w:pPr>
+      <w:spacing w:before="100" w:beforeAutospacing="1" w:after="100" w:afterAutospacing="1" w:line="240" w:lineRule="auto"/>
+    </w:pPr>
+    <w:rPr>
+      <w:rFonts w:ascii="Times New Roman" w:eastAsia="Times New Roman" w:hAnsi="Times New Roman" w:cs="Times New Roman"/>
+      <w:sz w:val="24"/>
+      <w:szCs w:val="24"/>
+      <w:lang w:bidi="ar-SA"/>
+    </w:rPr>
+  </w:style>
 </w:styles>
 </file>
 

</xml_diff>